<commit_message>
docs: add API endpoint reference; refresh codebase-summary counts; add public-URL callout to user manual Co-Authored-By: Claude Opus 4.8 <noreply@anthropic.com> Claude-Session: https://claude.ai/code/session_013BYKQmJmN7nRG7NrvcSEW7
</commit_message>
<xml_diff>
--- a/docs/USER_MANUAL.docx
+++ b/docs/USER_MANUAL.docx
@@ -4519,6 +4519,271 @@
       </w:r>
       <w:r>
         <w:t xml:space="preserve">; this section covers what a Furnish Hope staff member needs to know.</w:t>
+      </w:r>
+    </w:p>
+    <w:p>
+      <w:pPr>
+        <w:pStyle w:val="BlockText"/>
+      </w:pPr>
+      <w:r>
+        <w:t xml:space="preserve">🔗</w:t>
+      </w:r>
+      <w:r>
+        <w:t xml:space="preserve"> </w:t>
+      </w:r>
+      <w:r>
+        <w:rPr>
+          <w:bCs/>
+          <w:b/>
+        </w:rPr>
+        <w:t xml:space="preserve">Canonical public links (no login required).</w:t>
+      </w:r>
+      <w:r>
+        <w:t xml:space="preserve"> </w:t>
+      </w:r>
+      <w:r>
+        <w:t xml:space="preserve">These are the only public web addresses — share them exactly as written. Any other path (e.g.</w:t>
+      </w:r>
+      <w:r>
+        <w:t xml:space="preserve"> </w:t>
+      </w:r>
+      <w:r>
+        <w:rPr>
+          <w:rStyle w:val="VerbatimChar"/>
+        </w:rPr>
+        <w:t xml:space="preserve">/agencies/apply</w:t>
+      </w:r>
+      <w:r>
+        <w:t xml:space="preserve">) will bounce a visitor to the staff login page, because it isn't a real route. Replace</w:t>
+      </w:r>
+      <w:r>
+        <w:t xml:space="preserve"> </w:t>
+      </w:r>
+      <w:r>
+        <w:rPr>
+          <w:rStyle w:val="VerbatimChar"/>
+        </w:rPr>
+        <w:t xml:space="preserve">&lt;host&gt;</w:t>
+      </w:r>
+      <w:r>
+        <w:t xml:space="preserve"> </w:t>
+      </w:r>
+      <w:r>
+        <w:t xml:space="preserve">with your live address (currently</w:t>
+      </w:r>
+      <w:r>
+        <w:t xml:space="preserve"> </w:t>
+      </w:r>
+      <w:r>
+        <w:rPr>
+          <w:rStyle w:val="VerbatimChar"/>
+        </w:rPr>
+        <w:t xml:space="preserve">hammerhead-app-tk838.ondigitalocean.app</w:t>
+      </w:r>
+      <w:r>
+        <w:t xml:space="preserve">).</w:t>
+      </w:r>
+    </w:p>
+    <w:tbl>
+      <w:tblPr>
+        <w:tblStyle w:val="Table"/>
+        <w:tblW w:type="auto" w:w="0"/>
+        <w:tblLook w:firstRow="1" w:lastRow="0" w:firstColumn="0" w:lastColumn="0" w:noHBand="0" w:noVBand="0" w:val="0020"/>
+        <w:jc w:val="start"/>
+      </w:tblPr>
+      <w:tblGrid>
+        <w:gridCol w:w="3960"/>
+        <w:gridCol w:w="3960"/>
+      </w:tblGrid>
+      <w:tr>
+        <w:trPr>
+          <w:tblHeader w:val="true"/>
+        </w:trPr>
+        <w:tc>
+          <w:tcPr/>
+          <w:p>
+            <w:pPr>
+              <w:pStyle w:val="Compact"/>
+              <w:jc w:val="left"/>
+            </w:pPr>
+            <w:r>
+              <w:t xml:space="preserve">Page</w:t>
+            </w:r>
+          </w:p>
+        </w:tc>
+        <w:tc>
+          <w:tcPr/>
+          <w:p>
+            <w:pPr>
+              <w:pStyle w:val="Compact"/>
+              <w:jc w:val="left"/>
+            </w:pPr>
+            <w:r>
+              <w:t xml:space="preserve">URL</w:t>
+            </w:r>
+          </w:p>
+        </w:tc>
+      </w:tr>
+      <w:tr>
+        <w:tc>
+          <w:tcPr/>
+          <w:p>
+            <w:pPr>
+              <w:pStyle w:val="Compact"/>
+              <w:jc w:val="left"/>
+            </w:pPr>
+            <w:r>
+              <w:rPr>
+                <w:bCs/>
+                <w:b/>
+              </w:rPr>
+              <w:t xml:space="preserve">Agency application form</w:t>
+            </w:r>
+          </w:p>
+        </w:tc>
+        <w:tc>
+          <w:tcPr/>
+          <w:p>
+            <w:pPr>
+              <w:pStyle w:val="Compact"/>
+              <w:jc w:val="left"/>
+            </w:pPr>
+            <w:r>
+              <w:rPr>
+                <w:rStyle w:val="VerbatimChar"/>
+              </w:rPr>
+              <w:t xml:space="preserve">https://&lt;host&gt;/apply-to-refer</w:t>
+            </w:r>
+          </w:p>
+        </w:tc>
+      </w:tr>
+      <w:tr>
+        <w:tc>
+          <w:tcPr/>
+          <w:p>
+            <w:pPr>
+              <w:pStyle w:val="Compact"/>
+              <w:jc w:val="left"/>
+            </w:pPr>
+            <w:r>
+              <w:t xml:space="preserve">Public list of approved partner agencies</w:t>
+            </w:r>
+          </w:p>
+        </w:tc>
+        <w:tc>
+          <w:tcPr/>
+          <w:p>
+            <w:pPr>
+              <w:pStyle w:val="Compact"/>
+              <w:jc w:val="left"/>
+            </w:pPr>
+            <w:r>
+              <w:rPr>
+                <w:rStyle w:val="VerbatimChar"/>
+              </w:rPr>
+              <w:t xml:space="preserve">https://&lt;host&gt;/referring-agencies</w:t>
+            </w:r>
+          </w:p>
+        </w:tc>
+      </w:tr>
+      <w:tr>
+        <w:tc>
+          <w:tcPr/>
+          <w:p>
+            <w:pPr>
+              <w:pStyle w:val="Compact"/>
+              <w:jc w:val="left"/>
+            </w:pPr>
+            <w:r>
+              <w:t xml:space="preserve">Volunteer signup</w:t>
+            </w:r>
+          </w:p>
+        </w:tc>
+        <w:tc>
+          <w:tcPr/>
+          <w:p>
+            <w:pPr>
+              <w:pStyle w:val="Compact"/>
+              <w:jc w:val="left"/>
+            </w:pPr>
+            <w:r>
+              <w:rPr>
+                <w:rStyle w:val="VerbatimChar"/>
+              </w:rPr>
+              <w:t xml:space="preserve">https://&lt;host&gt;/volunteer</w:t>
+            </w:r>
+          </w:p>
+        </w:tc>
+      </w:tr>
+      <w:tr>
+        <w:tc>
+          <w:tcPr/>
+          <w:p>
+            <w:pPr>
+              <w:pStyle w:val="Compact"/>
+              <w:jc w:val="left"/>
+            </w:pPr>
+            <w:r>
+              <w:t xml:space="preserve">Caseworker registration</w:t>
+            </w:r>
+          </w:p>
+        </w:tc>
+        <w:tc>
+          <w:tcPr/>
+          <w:p>
+            <w:pPr>
+              <w:pStyle w:val="Compact"/>
+              <w:jc w:val="left"/>
+            </w:pPr>
+            <w:r>
+              <w:rPr>
+                <w:rStyle w:val="VerbatimChar"/>
+              </w:rPr>
+              <w:t xml:space="preserve">https://&lt;host&gt;/caseworker-register/&lt;token&gt;</w:t>
+            </w:r>
+            <w:r>
+              <w:t xml:space="preserve"> </w:t>
+            </w:r>
+            <w:r>
+              <w:t xml:space="preserve">(token is emailed by the Program Manager; not browsable directly)</w:t>
+            </w:r>
+          </w:p>
+        </w:tc>
+      </w:tr>
+    </w:tbl>
+    <w:p>
+      <w:pPr>
+        <w:pStyle w:val="BlockText"/>
+      </w:pPr>
+      <w:r>
+        <w:t xml:space="preserve">Everything else in the app requires a login. The staff app is at</w:t>
+      </w:r>
+      <w:r>
+        <w:t xml:space="preserve"> </w:t>
+      </w:r>
+      <w:r>
+        <w:rPr>
+          <w:rStyle w:val="VerbatimChar"/>
+        </w:rPr>
+        <w:t xml:space="preserve">https://&lt;host&gt;/</w:t>
+      </w:r>
+      <w:r>
+        <w:t xml:space="preserve"> </w:t>
+      </w:r>
+      <w:r>
+        <w:t xml:space="preserve">and the caseworker portal is at</w:t>
+      </w:r>
+      <w:r>
+        <w:t xml:space="preserve"> </w:t>
+      </w:r>
+      <w:r>
+        <w:rPr>
+          <w:rStyle w:val="VerbatimChar"/>
+        </w:rPr>
+        <w:t xml:space="preserve">https://&lt;host&gt;/agency</w:t>
+      </w:r>
+      <w:r>
+        <w:t xml:space="preserve">.</w:t>
       </w:r>
     </w:p>
     <w:bookmarkStart w:id="46" w:name="the-public-application-form"/>

</xml_diff>

<commit_message>
feat(clients): in-app document viewer for attachments + Documents card on Edit form
Reuses the shared /api/attachments store; adds DocViewerModal (PDF/image/text native, .docx via mammoth, .xlsx via SheetJS) with prev/next navigation. Docs updated.

Co-Authored-By: Claude Opus 4.8 <noreply@anthropic.com>

Claude-Session: https://claude.ai/code/session_013BYKQmJmN7nRG7NrvcSEW7
</commit_message>
<xml_diff>
--- a/docs/USER_MANUAL.docx
+++ b/docs/USER_MANUAL.docx
@@ -2,7 +2,7 @@
 <file path=word/document.xml><?xml version="1.0" encoding="utf-8"?>
 <w:document xmlns:w="http://schemas.openxmlformats.org/wordprocessingml/2006/main" xmlns:m="http://schemas.openxmlformats.org/officeDocument/2006/math" xmlns:r="http://schemas.openxmlformats.org/officeDocument/2006/relationships" xmlns:o="urn:schemas-microsoft-com:office:office" xmlns:v="urn:schemas-microsoft-com:vml" xmlns:w10="urn:schemas-microsoft-com:office:word" xmlns:a="http://schemas.openxmlformats.org/drawingml/2006/main" xmlns:pic="http://schemas.openxmlformats.org/drawingml/2006/picture" xmlns:wp="http://schemas.openxmlformats.org/drawingml/2006/wordprocessingDrawing">
   <w:body>
-    <w:bookmarkStart w:id="91" w:name="furnish-hope--staff-user-manual"/>
+    <w:bookmarkStart w:id="93" w:name="furnish-hope--staff-user-manual"/>
     <w:p>
       <w:pPr>
         <w:pStyle w:val="Heading1"/>
@@ -2949,7 +2949,7 @@
     </w:p>
     <w:bookmarkEnd w:id="35"/>
     <w:bookmarkEnd w:id="36"/>
-    <w:bookmarkStart w:id="45" w:name="working-with-clients-households"/>
+    <w:bookmarkStart w:id="46" w:name="working-with-clients-households"/>
     <w:p>
       <w:pPr>
         <w:pStyle w:val="Heading2"/>
@@ -4483,6 +4483,99 @@
         <w:t xml:space="preserve">[Screenshot: client-detail.png — a client detail page with their request history.]</w:t>
       </w:r>
     </w:p>
+    <w:bookmarkEnd w:id="44"/>
+    <w:bookmarkStart w:id="45" w:name="client-documents"/>
+    <w:p>
+      <w:pPr>
+        <w:pStyle w:val="Heading3"/>
+      </w:pPr>
+      <w:r>
+        <w:t xml:space="preserve">Client documents</w:t>
+      </w:r>
+    </w:p>
+    <w:p>
+      <w:pPr>
+        <w:pStyle w:val="FirstParagraph"/>
+      </w:pPr>
+      <w:r>
+        <w:t xml:space="preserve">Each client has a</w:t>
+      </w:r>
+      <w:r>
+        <w:t xml:space="preserve"> </w:t>
+      </w:r>
+      <w:r>
+        <w:rPr>
+          <w:bCs/>
+          <w:b/>
+        </w:rPr>
+        <w:t xml:space="preserve">Documents</w:t>
+      </w:r>
+      <w:r>
+        <w:t xml:space="preserve"> </w:t>
+      </w:r>
+      <w:r>
+        <w:t xml:space="preserve">card for attaching files to that household — referral paperwork, IDs, signed forms, photos, spreadsheets, anything relevant. It appears in</w:t>
+      </w:r>
+      <w:r>
+        <w:t xml:space="preserve"> </w:t>
+      </w:r>
+      <w:r>
+        <w:rPr>
+          <w:bCs/>
+          <w:b/>
+        </w:rPr>
+        <w:t xml:space="preserve">two places</w:t>
+      </w:r>
+      <w:r>
+        <w:t xml:space="preserve">: on the client's</w:t>
+      </w:r>
+      <w:r>
+        <w:t xml:space="preserve"> </w:t>
+      </w:r>
+      <w:r>
+        <w:rPr>
+          <w:bCs/>
+          <w:b/>
+        </w:rPr>
+        <w:t xml:space="preserve">profile page</w:t>
+      </w:r>
+      <w:r>
+        <w:t xml:space="preserve"> </w:t>
+      </w:r>
+      <w:r>
+        <w:t xml:space="preserve">(bottom of the page) and on the</w:t>
+      </w:r>
+      <w:r>
+        <w:t xml:space="preserve"> </w:t>
+      </w:r>
+      <w:r>
+        <w:rPr>
+          <w:bCs/>
+          <w:b/>
+        </w:rPr>
+        <w:t xml:space="preserve">Edit Client</w:t>
+      </w:r>
+      <w:r>
+        <w:t xml:space="preserve"> </w:t>
+      </w:r>
+      <w:r>
+        <w:t xml:space="preserve">form (shown once the client has been saved). Drag files in or click to upload, then click any file name to preview it in the popup viewer (see</w:t>
+      </w:r>
+      <w:r>
+        <w:t xml:space="preserve"> </w:t>
+      </w:r>
+      <w:hyperlink w:anchor="files--attachments">
+        <w:r>
+          <w:rPr>
+            <w:rStyle w:val="Hyperlink"/>
+          </w:rPr>
+          <w:t xml:space="preserve">Files &amp; Attachments</w:t>
+        </w:r>
+      </w:hyperlink>
+      <w:r>
+        <w:t xml:space="preserve">). The documents belong to the client record and follow the same access rules as the rest of the client's information.</w:t>
+      </w:r>
+    </w:p>
     <w:p>
       <w:r>
         <w:pict>
@@ -4490,9 +4583,9 @@
         </w:pict>
       </w:r>
     </w:p>
-    <w:bookmarkEnd w:id="44"/>
     <w:bookmarkEnd w:id="45"/>
-    <w:bookmarkStart w:id="52" w:name="partner-agency-onboarding"/>
+    <w:bookmarkEnd w:id="46"/>
+    <w:bookmarkStart w:id="53" w:name="partner-agency-onboarding"/>
     <w:p>
       <w:pPr>
         <w:pStyle w:val="Heading2"/>
@@ -4786,7 +4879,7 @@
         <w:t xml:space="preserve">.</w:t>
       </w:r>
     </w:p>
-    <w:bookmarkStart w:id="46" w:name="the-public-application-form"/>
+    <w:bookmarkStart w:id="47" w:name="the-public-application-form"/>
     <w:p>
       <w:pPr>
         <w:pStyle w:val="Heading3"/>
@@ -4962,8 +5055,8 @@
         <w:t xml:space="preserve">The form is rate-limited (5 per 15 minutes per IP) and honeypot-guarded, so bot fills are dropped silently.</w:t>
       </w:r>
     </w:p>
-    <w:bookmarkEnd w:id="46"/>
-    <w:bookmarkStart w:id="47" w:name="the-applications-review-queue"/>
+    <w:bookmarkEnd w:id="47"/>
+    <w:bookmarkStart w:id="48" w:name="the-applications-review-queue"/>
     <w:p>
       <w:pPr>
         <w:pStyle w:val="Heading3"/>
@@ -5226,8 +5319,8 @@
         <w:t xml:space="preserve">inbox is connected, the review page will offer a "Send now" button; until then, copy-paste is the interim.</w:t>
       </w:r>
     </w:p>
-    <w:bookmarkEnd w:id="47"/>
-    <w:bookmarkStart w:id="48" w:name="caseworker-signup"/>
+    <w:bookmarkEnd w:id="48"/>
+    <w:bookmarkStart w:id="49" w:name="caseworker-signup"/>
     <w:p>
       <w:pPr>
         <w:pStyle w:val="Heading3"/>
@@ -5276,8 +5369,8 @@
         <w:t xml:space="preserve">Tokens are single-use and expire after 14 days. Reissue from the review page if a caseworker misses the window.</w:t>
       </w:r>
     </w:p>
-    <w:bookmarkEnd w:id="48"/>
-    <w:bookmarkStart w:id="49" w:name="program-manager-role"/>
+    <w:bookmarkEnd w:id="49"/>
+    <w:bookmarkStart w:id="50" w:name="program-manager-role"/>
     <w:p>
       <w:pPr>
         <w:pStyle w:val="Heading3"/>
@@ -5325,8 +5418,8 @@
         <w:t xml:space="preserve">box on any staff account. Program Managers see the Applications queue and the approve/reject/preview actions. Administrators have PM powers implicitly.</w:t>
       </w:r>
     </w:p>
-    <w:bookmarkEnd w:id="49"/>
-    <w:bookmarkStart w:id="50" w:name="the-public-agencies-list"/>
+    <w:bookmarkEnd w:id="50"/>
+    <w:bookmarkStart w:id="51" w:name="the-public-agencies-list"/>
     <w:p>
       <w:pPr>
         <w:pStyle w:val="Heading3"/>
@@ -5378,8 +5471,8 @@
         <w:t xml:space="preserve">, disappear from this page immediately.</w:t>
       </w:r>
     </w:p>
-    <w:bookmarkEnd w:id="50"/>
-    <w:bookmarkStart w:id="51" w:name="X2a537d2e3c75beb74579cccc2f0f0e1f27345f0"/>
+    <w:bookmarkEnd w:id="51"/>
+    <w:bookmarkStart w:id="52" w:name="X2a537d2e3c75beb74579cccc2f0f0e1f27345f0"/>
     <w:p>
       <w:pPr>
         <w:pStyle w:val="Heading3"/>
@@ -5487,9 +5580,9 @@
         </w:pict>
       </w:r>
     </w:p>
-    <w:bookmarkEnd w:id="51"/>
     <w:bookmarkEnd w:id="52"/>
-    <w:bookmarkStart w:id="53" w:name="pickups"/>
+    <w:bookmarkEnd w:id="53"/>
+    <w:bookmarkStart w:id="54" w:name="pickups"/>
     <w:p>
       <w:pPr>
         <w:pStyle w:val="Heading2"/>
@@ -5611,8 +5704,8 @@
         </w:pict>
       </w:r>
     </w:p>
-    <w:bookmarkEnd w:id="53"/>
-    <w:bookmarkStart w:id="54" w:name="deliveries"/>
+    <w:bookmarkEnd w:id="54"/>
+    <w:bookmarkStart w:id="55" w:name="deliveries"/>
     <w:p>
       <w:pPr>
         <w:pStyle w:val="Heading2"/>
@@ -5696,8 +5789,8 @@
         </w:pict>
       </w:r>
     </w:p>
-    <w:bookmarkEnd w:id="54"/>
-    <w:bookmarkStart w:id="55" w:name="inventory"/>
+    <w:bookmarkEnd w:id="55"/>
+    <w:bookmarkStart w:id="56" w:name="inventory"/>
     <w:p>
       <w:pPr>
         <w:pStyle w:val="Heading2"/>
@@ -5895,8 +5988,8 @@
         </w:pict>
       </w:r>
     </w:p>
-    <w:bookmarkEnd w:id="55"/>
-    <w:bookmarkStart w:id="59" w:name="volunteers--shifts"/>
+    <w:bookmarkEnd w:id="56"/>
+    <w:bookmarkStart w:id="60" w:name="volunteers--shifts"/>
     <w:p>
       <w:pPr>
         <w:pStyle w:val="Heading2"/>
@@ -5905,7 +5998,7 @@
         <w:t xml:space="preserve">Volunteers &amp; Shifts</w:t>
       </w:r>
     </w:p>
-    <w:bookmarkStart w:id="56" w:name="adding-a-volunteer"/>
+    <w:bookmarkStart w:id="57" w:name="adding-a-volunteer"/>
     <w:p>
       <w:pPr>
         <w:pStyle w:val="Heading3"/>
@@ -5979,8 +6072,8 @@
         <w:t xml:space="preserve">Save.</w:t>
       </w:r>
     </w:p>
-    <w:bookmarkEnd w:id="56"/>
-    <w:bookmarkStart w:id="57" w:name="scheduling-shifts"/>
+    <w:bookmarkEnd w:id="57"/>
+    <w:bookmarkStart w:id="58" w:name="scheduling-shifts"/>
     <w:p>
       <w:pPr>
         <w:pStyle w:val="Heading3"/>
@@ -6072,8 +6165,8 @@
         <w:t xml:space="preserve">[Screenshot: shift-template.png — the shift template form with day-of-week toggle buttons.]</w:t>
       </w:r>
     </w:p>
-    <w:bookmarkEnd w:id="57"/>
-    <w:bookmarkStart w:id="58" w:name="recording-volunteer-hours"/>
+    <w:bookmarkEnd w:id="58"/>
+    <w:bookmarkStart w:id="59" w:name="recording-volunteer-hours"/>
     <w:p>
       <w:pPr>
         <w:pStyle w:val="Heading3"/>
@@ -6149,9 +6242,9 @@
         </w:pict>
       </w:r>
     </w:p>
-    <w:bookmarkEnd w:id="58"/>
     <w:bookmarkEnd w:id="59"/>
-    <w:bookmarkStart w:id="60" w:name="calendar"/>
+    <w:bookmarkEnd w:id="60"/>
+    <w:bookmarkStart w:id="61" w:name="calendar"/>
     <w:p>
       <w:pPr>
         <w:pStyle w:val="Heading2"/>
@@ -6238,8 +6331,8 @@
         </w:pict>
       </w:r>
     </w:p>
-    <w:bookmarkEnd w:id="60"/>
-    <w:bookmarkStart w:id="63" w:name="campaigns--events"/>
+    <w:bookmarkEnd w:id="61"/>
+    <w:bookmarkStart w:id="64" w:name="campaigns--events"/>
     <w:p>
       <w:pPr>
         <w:pStyle w:val="Heading2"/>
@@ -6248,7 +6341,7 @@
         <w:t xml:space="preserve">Campaigns &amp; Events</w:t>
       </w:r>
     </w:p>
-    <w:bookmarkStart w:id="61" w:name="campaigns"/>
+    <w:bookmarkStart w:id="62" w:name="campaigns"/>
     <w:p>
       <w:pPr>
         <w:pStyle w:val="Heading3"/>
@@ -6317,8 +6410,8 @@
         <w:t xml:space="preserve">You can see all campaigns and their progress on the Dashboard.</w:t>
       </w:r>
     </w:p>
-    <w:bookmarkEnd w:id="61"/>
-    <w:bookmarkStart w:id="62" w:name="events"/>
+    <w:bookmarkEnd w:id="62"/>
+    <w:bookmarkStart w:id="63" w:name="events"/>
     <w:p>
       <w:pPr>
         <w:pStyle w:val="Heading3"/>
@@ -6405,9 +6498,9 @@
         </w:pict>
       </w:r>
     </w:p>
-    <w:bookmarkEnd w:id="62"/>
     <w:bookmarkEnd w:id="63"/>
-    <w:bookmarkStart w:id="68" w:name="email-mailbox"/>
+    <w:bookmarkEnd w:id="64"/>
+    <w:bookmarkStart w:id="69" w:name="email-mailbox"/>
     <w:p>
       <w:pPr>
         <w:pStyle w:val="Heading2"/>
@@ -6440,7 +6533,7 @@
         <w:t xml:space="preserve">— never another staff member's.</w:t>
       </w:r>
     </w:p>
-    <w:bookmarkStart w:id="64" w:name="X054a811c13f66481d3b57c4bc615f1ca6f3b8ab"/>
+    <w:bookmarkStart w:id="65" w:name="X054a811c13f66481d3b57c4bc615f1ca6f3b8ab"/>
     <w:p>
       <w:pPr>
         <w:pStyle w:val="Heading3"/>
@@ -6637,8 +6730,8 @@
         <w:t xml:space="preserve">Most email providers (Gmail, Microsoft, Yahoo) require you to generate an "app password" for third-party apps. Your normal login password won't work. Your administrator can help — instructions are in Appendix A → Email account setup.</w:t>
       </w:r>
     </w:p>
-    <w:bookmarkEnd w:id="64"/>
-    <w:bookmarkStart w:id="65" w:name="reading-mail"/>
+    <w:bookmarkEnd w:id="65"/>
+    <w:bookmarkStart w:id="66" w:name="reading-mail"/>
     <w:p>
       <w:pPr>
         <w:pStyle w:val="Heading3"/>
@@ -6763,8 +6856,8 @@
         <w:t xml:space="preserve">[Screenshot: mailbox.png — the mailbox with unread messages visible and one expanded.]</w:t>
       </w:r>
     </w:p>
-    <w:bookmarkEnd w:id="65"/>
-    <w:bookmarkStart w:id="66" w:name="composing-a-new-message"/>
+    <w:bookmarkEnd w:id="66"/>
+    <w:bookmarkStart w:id="67" w:name="composing-a-new-message"/>
     <w:p>
       <w:pPr>
         <w:pStyle w:val="Heading3"/>
@@ -6860,8 +6953,8 @@
         <w:t xml:space="preserve">.</w:t>
       </w:r>
     </w:p>
-    <w:bookmarkEnd w:id="66"/>
-    <w:bookmarkStart w:id="67" w:name="email-from-a-record"/>
+    <w:bookmarkEnd w:id="67"/>
+    <w:bookmarkStart w:id="68" w:name="email-from-a-record"/>
     <w:p>
       <w:pPr>
         <w:pStyle w:val="Heading3"/>
@@ -6925,9 +7018,9 @@
         </w:pict>
       </w:r>
     </w:p>
-    <w:bookmarkEnd w:id="67"/>
     <w:bookmarkEnd w:id="68"/>
-    <w:bookmarkStart w:id="72" w:name="files--attachments"/>
+    <w:bookmarkEnd w:id="69"/>
+    <w:bookmarkStart w:id="74" w:name="files--attachments"/>
     <w:p>
       <w:pPr>
         <w:pStyle w:val="Heading2"/>
@@ -6944,7 +7037,7 @@
         <w:t xml:space="preserve">You can attach files (photos, signed documents, PDFs, etc.) to most records — donors, clients, pickups, deliveries, contacts, volunteers, vehicles, agencies, corporate facilities.</w:t>
       </w:r>
     </w:p>
-    <w:bookmarkStart w:id="69" w:name="attaching-a-file"/>
+    <w:bookmarkStart w:id="70" w:name="attaching-a-file"/>
     <w:p>
       <w:pPr>
         <w:pStyle w:val="Heading3"/>
@@ -7038,13 +7131,234 @@
         <w:t xml:space="preserve">[Screenshot: attachments-widget.png — the attachments widget with one file uploaded and visible in the list.]</w:t>
       </w:r>
     </w:p>
-    <w:bookmarkEnd w:id="69"/>
-    <w:bookmarkStart w:id="70" w:name="editing-downloading-deleting"/>
+    <w:bookmarkEnd w:id="70"/>
+    <w:bookmarkStart w:id="71" w:name="viewing-a-file-in-app-popup"/>
     <w:p>
       <w:pPr>
         <w:pStyle w:val="Heading3"/>
       </w:pPr>
       <w:r>
+        <w:t xml:space="preserve">Viewing a file (in-app popup)</w:t>
+      </w:r>
+    </w:p>
+    <w:p>
+      <w:pPr>
+        <w:numPr>
+          <w:ilvl w:val="0"/>
+          <w:numId w:val="1036"/>
+        </w:numPr>
+        <w:pStyle w:val="Compact"/>
+      </w:pPr>
+      <w:r>
+        <w:rPr>
+          <w:bCs/>
+          <w:b/>
+        </w:rPr>
+        <w:t xml:space="preserve">Click the file name</w:t>
+      </w:r>
+      <w:r>
+        <w:t xml:space="preserve"> </w:t>
+      </w:r>
+      <w:r>
+        <w:t xml:space="preserve">(or the</w:t>
+      </w:r>
+      <w:r>
+        <w:t xml:space="preserve"> </w:t>
+      </w:r>
+      <w:r>
+        <w:rPr>
+          <w:bCs/>
+          <w:b/>
+        </w:rPr>
+        <w:t xml:space="preserve">View</w:t>
+      </w:r>
+      <w:r>
+        <w:t xml:space="preserve"> </w:t>
+      </w:r>
+      <w:r>
+        <w:t xml:space="preserve">link) to open the document in a popup viewer, right inside the app — no download needed.</w:t>
+      </w:r>
+    </w:p>
+    <w:p>
+      <w:pPr>
+        <w:numPr>
+          <w:ilvl w:val="0"/>
+          <w:numId w:val="1036"/>
+        </w:numPr>
+        <w:pStyle w:val="Compact"/>
+      </w:pPr>
+      <w:r>
+        <w:rPr>
+          <w:bCs/>
+          <w:b/>
+        </w:rPr>
+        <w:t xml:space="preserve">PDFs</w:t>
+      </w:r>
+      <w:r>
+        <w:t xml:space="preserve"> </w:t>
+      </w:r>
+      <w:r>
+        <w:t xml:space="preserve">open with full page-by-page navigation and zoom (the viewer uses your browser's built-in PDF reader).</w:t>
+      </w:r>
+      <w:r>
+        <w:t xml:space="preserve"> </w:t>
+      </w:r>
+      <w:r>
+        <w:rPr>
+          <w:bCs/>
+          <w:b/>
+        </w:rPr>
+        <w:t xml:space="preserve">Images</w:t>
+      </w:r>
+      <w:r>
+        <w:t xml:space="preserve">,</w:t>
+      </w:r>
+      <w:r>
+        <w:t xml:space="preserve"> </w:t>
+      </w:r>
+      <w:r>
+        <w:rPr>
+          <w:bCs/>
+          <w:b/>
+        </w:rPr>
+        <w:t xml:space="preserve">plain-text / Markdown / CSV</w:t>
+      </w:r>
+      <w:r>
+        <w:t xml:space="preserve">,</w:t>
+      </w:r>
+      <w:r>
+        <w:t xml:space="preserve"> </w:t>
+      </w:r>
+      <w:r>
+        <w:rPr>
+          <w:bCs/>
+          <w:b/>
+        </w:rPr>
+        <w:t xml:space="preserve">Word (.docx)</w:t>
+      </w:r>
+      <w:r>
+        <w:t xml:space="preserve">, and</w:t>
+      </w:r>
+      <w:r>
+        <w:t xml:space="preserve"> </w:t>
+      </w:r>
+      <w:r>
+        <w:rPr>
+          <w:bCs/>
+          <w:b/>
+        </w:rPr>
+        <w:t xml:space="preserve">Excel (.xlsx)</w:t>
+      </w:r>
+      <w:r>
+        <w:t xml:space="preserve"> </w:t>
+      </w:r>
+      <w:r>
+        <w:t xml:space="preserve">files also preview directly in the popup — Excel workbooks show a tab per sheet.</w:t>
+      </w:r>
+    </w:p>
+    <w:p>
+      <w:pPr>
+        <w:numPr>
+          <w:ilvl w:val="0"/>
+          <w:numId w:val="1036"/>
+        </w:numPr>
+        <w:pStyle w:val="Compact"/>
+      </w:pPr>
+      <w:r>
+        <w:rPr>
+          <w:bCs/>
+          <w:b/>
+        </w:rPr>
+        <w:t xml:space="preserve">‹ / › arrows</w:t>
+      </w:r>
+      <w:r>
+        <w:t xml:space="preserve"> </w:t>
+      </w:r>
+      <w:r>
+        <w:t xml:space="preserve">at the top of the popup (or your keyboard's left/right arrows) step through all the files on that record without closing the viewer;</w:t>
+      </w:r>
+      <w:r>
+        <w:t xml:space="preserve"> </w:t>
+      </w:r>
+      <w:r>
+        <w:rPr>
+          <w:bCs/>
+          <w:b/>
+        </w:rPr>
+        <w:t xml:space="preserve">Esc</w:t>
+      </w:r>
+      <w:r>
+        <w:t xml:space="preserve"> </w:t>
+      </w:r>
+      <w:r>
+        <w:t xml:space="preserve">closes it.</w:t>
+      </w:r>
+    </w:p>
+    <w:p>
+      <w:pPr>
+        <w:numPr>
+          <w:ilvl w:val="0"/>
+          <w:numId w:val="1036"/>
+        </w:numPr>
+        <w:pStyle w:val="Compact"/>
+      </w:pPr>
+      <w:r>
+        <w:t xml:space="preserve">A few older or specialized formats (</w:t>
+      </w:r>
+      <w:r>
+        <w:rPr>
+          <w:rStyle w:val="VerbatimChar"/>
+        </w:rPr>
+        <w:t xml:space="preserve">.doc</w:t>
+      </w:r>
+      <w:r>
+        <w:t xml:space="preserve">,</w:t>
+      </w:r>
+      <w:r>
+        <w:t xml:space="preserve"> </w:t>
+      </w:r>
+      <w:r>
+        <w:rPr>
+          <w:rStyle w:val="VerbatimChar"/>
+        </w:rPr>
+        <w:t xml:space="preserve">.ppt</w:t>
+      </w:r>
+      <w:r>
+        <w:t xml:space="preserve">/</w:t>
+      </w:r>
+      <w:r>
+        <w:rPr>
+          <w:rStyle w:val="VerbatimChar"/>
+        </w:rPr>
+        <w:t xml:space="preserve">.pptx</w:t>
+      </w:r>
+      <w:r>
+        <w:t xml:space="preserve">, archives) can't be previewed in the browser — the popup gives you a</w:t>
+      </w:r>
+      <w:r>
+        <w:t xml:space="preserve"> </w:t>
+      </w:r>
+      <w:r>
+        <w:rPr>
+          <w:bCs/>
+          <w:b/>
+        </w:rPr>
+        <w:t xml:space="preserve">Download</w:t>
+      </w:r>
+      <w:r>
+        <w:t xml:space="preserve"> </w:t>
+      </w:r>
+      <w:r>
+        <w:t xml:space="preserve">button to open them in the matching app instead.</w:t>
+      </w:r>
+    </w:p>
+    <w:bookmarkEnd w:id="71"/>
+    <w:bookmarkStart w:id="72" w:name="editing-downloading-deleting"/>
+    <w:p>
+      <w:pPr>
+        <w:pStyle w:val="Heading3"/>
+      </w:pPr>
+      <w:r>
         <w:t xml:space="preserve">Editing, downloading, deleting</w:t>
       </w:r>
     </w:p>
@@ -7052,70 +7366,70 @@
       <w:pPr>
         <w:numPr>
           <w:ilvl w:val="0"/>
-          <w:numId w:val="1036"/>
-        </w:numPr>
-        <w:pStyle w:val="Compact"/>
-      </w:pPr>
-      <w:r>
-        <w:rPr>
-          <w:bCs/>
-          <w:b/>
-        </w:rPr>
-        <w:t xml:space="preserve">Click the file name</w:t>
-      </w:r>
-      <w:r>
-        <w:t xml:space="preserve"> </w:t>
-      </w:r>
-      <w:r>
-        <w:t xml:space="preserve">to download it.</w:t>
-      </w:r>
-    </w:p>
-    <w:p>
-      <w:pPr>
-        <w:numPr>
-          <w:ilvl w:val="0"/>
-          <w:numId w:val="1036"/>
-        </w:numPr>
-        <w:pStyle w:val="Compact"/>
-      </w:pPr>
-      <w:r>
-        <w:rPr>
-          <w:bCs/>
-          <w:b/>
-        </w:rPr>
-        <w:t xml:space="preserve">Pencil icon</w:t>
-      </w:r>
-      <w:r>
-        <w:t xml:space="preserve"> </w:t>
-      </w:r>
-      <w:r>
-        <w:t xml:space="preserve">to rename or change the description.</w:t>
-      </w:r>
-    </w:p>
-    <w:p>
-      <w:pPr>
-        <w:numPr>
-          <w:ilvl w:val="0"/>
-          <w:numId w:val="1036"/>
-        </w:numPr>
-        <w:pStyle w:val="Compact"/>
-      </w:pPr>
-      <w:r>
-        <w:rPr>
-          <w:bCs/>
-          <w:b/>
-        </w:rPr>
-        <w:t xml:space="preserve">Trash icon</w:t>
-      </w:r>
-      <w:r>
-        <w:t xml:space="preserve"> </w:t>
-      </w:r>
-      <w:r>
-        <w:t xml:space="preserve">to delete (you'll be asked to confirm).</w:t>
-      </w:r>
-    </w:p>
-    <w:bookmarkEnd w:id="70"/>
-    <w:bookmarkStart w:id="71" w:name="what-can-i-attach"/>
+          <w:numId w:val="1037"/>
+        </w:numPr>
+        <w:pStyle w:val="Compact"/>
+      </w:pPr>
+      <w:r>
+        <w:rPr>
+          <w:bCs/>
+          <w:b/>
+        </w:rPr>
+        <w:t xml:space="preserve">Download</w:t>
+      </w:r>
+      <w:r>
+        <w:t xml:space="preserve"> </w:t>
+      </w:r>
+      <w:r>
+        <w:t xml:space="preserve">link on each row saves the original file to your computer.</w:t>
+      </w:r>
+    </w:p>
+    <w:p>
+      <w:pPr>
+        <w:numPr>
+          <w:ilvl w:val="0"/>
+          <w:numId w:val="1037"/>
+        </w:numPr>
+        <w:pStyle w:val="Compact"/>
+      </w:pPr>
+      <w:r>
+        <w:rPr>
+          <w:bCs/>
+          <w:b/>
+        </w:rPr>
+        <w:t xml:space="preserve">Edit</w:t>
+      </w:r>
+      <w:r>
+        <w:t xml:space="preserve"> </w:t>
+      </w:r>
+      <w:r>
+        <w:t xml:space="preserve">to rename the file or change its description.</w:t>
+      </w:r>
+    </w:p>
+    <w:p>
+      <w:pPr>
+        <w:numPr>
+          <w:ilvl w:val="0"/>
+          <w:numId w:val="1037"/>
+        </w:numPr>
+        <w:pStyle w:val="Compact"/>
+      </w:pPr>
+      <w:r>
+        <w:rPr>
+          <w:bCs/>
+          <w:b/>
+        </w:rPr>
+        <w:t xml:space="preserve">Delete</w:t>
+      </w:r>
+      <w:r>
+        <w:t xml:space="preserve"> </w:t>
+      </w:r>
+      <w:r>
+        <w:t xml:space="preserve">to remove it (you'll be asked to confirm).</w:t>
+      </w:r>
+    </w:p>
+    <w:bookmarkEnd w:id="72"/>
+    <w:bookmarkStart w:id="73" w:name="what-can-i-attach"/>
     <w:p>
       <w:pPr>
         <w:pStyle w:val="Heading3"/>
@@ -7139,7 +7453,7 @@
           <w:bCs/>
           <w:b/>
         </w:rPr>
-        <w:t xml:space="preserve">20MB per file</w:t>
+        <w:t xml:space="preserve">10MB per file</w:t>
       </w:r>
       <w:r>
         <w:t xml:space="preserve">. For very large files (e.g., long video recordings), don't attach them — store them in cloud storage and put the link in a note.</w:t>
@@ -7152,9 +7466,9 @@
         </w:pict>
       </w:r>
     </w:p>
-    <w:bookmarkEnd w:id="71"/>
-    <w:bookmarkEnd w:id="72"/>
-    <w:bookmarkStart w:id="73" w:name="reports"/>
+    <w:bookmarkEnd w:id="73"/>
+    <w:bookmarkEnd w:id="74"/>
+    <w:bookmarkStart w:id="75" w:name="reports"/>
     <w:p>
       <w:pPr>
         <w:pStyle w:val="Heading2"/>
@@ -7220,7 +7534,7 @@
       <w:pPr>
         <w:numPr>
           <w:ilvl w:val="0"/>
-          <w:numId w:val="1037"/>
+          <w:numId w:val="1038"/>
         </w:numPr>
         <w:pStyle w:val="Compact"/>
       </w:pPr>
@@ -7232,7 +7546,7 @@
       <w:pPr>
         <w:numPr>
           <w:ilvl w:val="0"/>
-          <w:numId w:val="1037"/>
+          <w:numId w:val="1038"/>
         </w:numPr>
         <w:pStyle w:val="Compact"/>
       </w:pPr>
@@ -7244,7 +7558,7 @@
       <w:pPr>
         <w:numPr>
           <w:ilvl w:val="0"/>
-          <w:numId w:val="1037"/>
+          <w:numId w:val="1038"/>
         </w:numPr>
         <w:pStyle w:val="Compact"/>
       </w:pPr>
@@ -7256,7 +7570,7 @@
       <w:pPr>
         <w:numPr>
           <w:ilvl w:val="0"/>
-          <w:numId w:val="1037"/>
+          <w:numId w:val="1038"/>
         </w:numPr>
         <w:pStyle w:val="Compact"/>
       </w:pPr>
@@ -7268,7 +7582,7 @@
       <w:pPr>
         <w:numPr>
           <w:ilvl w:val="0"/>
-          <w:numId w:val="1037"/>
+          <w:numId w:val="1038"/>
         </w:numPr>
         <w:pStyle w:val="Compact"/>
       </w:pPr>
@@ -7280,7 +7594,7 @@
       <w:pPr>
         <w:numPr>
           <w:ilvl w:val="0"/>
-          <w:numId w:val="1037"/>
+          <w:numId w:val="1038"/>
         </w:numPr>
         <w:pStyle w:val="Compact"/>
       </w:pPr>
@@ -7292,7 +7606,7 @@
       <w:pPr>
         <w:numPr>
           <w:ilvl w:val="0"/>
-          <w:numId w:val="1037"/>
+          <w:numId w:val="1038"/>
         </w:numPr>
         <w:pStyle w:val="Compact"/>
       </w:pPr>
@@ -7304,7 +7618,7 @@
       <w:pPr>
         <w:numPr>
           <w:ilvl w:val="0"/>
-          <w:numId w:val="1037"/>
+          <w:numId w:val="1038"/>
         </w:numPr>
         <w:pStyle w:val="Compact"/>
       </w:pPr>
@@ -7316,7 +7630,7 @@
       <w:pPr>
         <w:numPr>
           <w:ilvl w:val="0"/>
-          <w:numId w:val="1037"/>
+          <w:numId w:val="1038"/>
         </w:numPr>
         <w:pStyle w:val="Compact"/>
       </w:pPr>
@@ -7328,7 +7642,7 @@
       <w:pPr>
         <w:numPr>
           <w:ilvl w:val="0"/>
-          <w:numId w:val="1037"/>
+          <w:numId w:val="1038"/>
         </w:numPr>
         <w:pStyle w:val="Compact"/>
       </w:pPr>
@@ -7340,7 +7654,7 @@
       <w:pPr>
         <w:numPr>
           <w:ilvl w:val="0"/>
-          <w:numId w:val="1037"/>
+          <w:numId w:val="1038"/>
         </w:numPr>
         <w:pStyle w:val="Compact"/>
       </w:pPr>
@@ -7352,7 +7666,7 @@
       <w:pPr>
         <w:numPr>
           <w:ilvl w:val="0"/>
-          <w:numId w:val="1037"/>
+          <w:numId w:val="1038"/>
         </w:numPr>
         <w:pStyle w:val="Compact"/>
       </w:pPr>
@@ -7364,7 +7678,7 @@
       <w:pPr>
         <w:numPr>
           <w:ilvl w:val="0"/>
-          <w:numId w:val="1037"/>
+          <w:numId w:val="1038"/>
         </w:numPr>
         <w:pStyle w:val="Compact"/>
       </w:pPr>
@@ -7376,7 +7690,7 @@
       <w:pPr>
         <w:numPr>
           <w:ilvl w:val="0"/>
-          <w:numId w:val="1037"/>
+          <w:numId w:val="1038"/>
         </w:numPr>
         <w:pStyle w:val="Compact"/>
       </w:pPr>
@@ -7388,7 +7702,7 @@
       <w:pPr>
         <w:numPr>
           <w:ilvl w:val="0"/>
-          <w:numId w:val="1037"/>
+          <w:numId w:val="1038"/>
         </w:numPr>
         <w:pStyle w:val="Compact"/>
       </w:pPr>
@@ -7400,7 +7714,7 @@
       <w:pPr>
         <w:numPr>
           <w:ilvl w:val="0"/>
-          <w:numId w:val="1037"/>
+          <w:numId w:val="1038"/>
         </w:numPr>
         <w:pStyle w:val="Compact"/>
       </w:pPr>
@@ -7561,8 +7875,8 @@
         </w:pict>
       </w:r>
     </w:p>
-    <w:bookmarkEnd w:id="73"/>
-    <w:bookmarkStart w:id="76" w:name="quickbooks-sync"/>
+    <w:bookmarkEnd w:id="75"/>
+    <w:bookmarkStart w:id="78" w:name="quickbooks-sync"/>
     <w:p>
       <w:pPr>
         <w:pStyle w:val="Heading2"/>
@@ -7579,7 +7893,7 @@
         <w:t xml:space="preserve">If your organization uses QuickBooks Online, donations sync automatically.</w:t>
       </w:r>
     </w:p>
-    <w:bookmarkStart w:id="74" w:name="what-syncs"/>
+    <w:bookmarkStart w:id="76" w:name="what-syncs"/>
     <w:p>
       <w:pPr>
         <w:pStyle w:val="Heading3"/>
@@ -7592,7 +7906,7 @@
       <w:pPr>
         <w:numPr>
           <w:ilvl w:val="0"/>
-          <w:numId w:val="1038"/>
+          <w:numId w:val="1039"/>
         </w:numPr>
         <w:pStyle w:val="Compact"/>
       </w:pPr>
@@ -7620,7 +7934,7 @@
       <w:pPr>
         <w:numPr>
           <w:ilvl w:val="0"/>
-          <w:numId w:val="1038"/>
+          <w:numId w:val="1039"/>
         </w:numPr>
         <w:pStyle w:val="Compact"/>
       </w:pPr>
@@ -7648,7 +7962,7 @@
       <w:pPr>
         <w:numPr>
           <w:ilvl w:val="0"/>
-          <w:numId w:val="1038"/>
+          <w:numId w:val="1039"/>
         </w:numPr>
         <w:pStyle w:val="Compact"/>
       </w:pPr>
@@ -7669,8 +7983,8 @@
         <w:t xml:space="preserve">.</w:t>
       </w:r>
     </w:p>
-    <w:bookmarkEnd w:id="74"/>
-    <w:bookmarkStart w:id="75" w:name="where-to-see-sync-status"/>
+    <w:bookmarkEnd w:id="76"/>
+    <w:bookmarkStart w:id="77" w:name="where-to-see-sync-status"/>
     <w:p>
       <w:pPr>
         <w:pStyle w:val="Heading3"/>
@@ -7707,7 +8021,7 @@
       <w:pPr>
         <w:numPr>
           <w:ilvl w:val="0"/>
-          <w:numId w:val="1039"/>
+          <w:numId w:val="1040"/>
         </w:numPr>
         <w:pStyle w:val="Compact"/>
       </w:pPr>
@@ -7729,7 +8043,7 @@
       <w:pPr>
         <w:numPr>
           <w:ilvl w:val="0"/>
-          <w:numId w:val="1039"/>
+          <w:numId w:val="1040"/>
         </w:numPr>
         <w:pStyle w:val="Compact"/>
       </w:pPr>
@@ -7751,7 +8065,7 @@
       <w:pPr>
         <w:numPr>
           <w:ilvl w:val="0"/>
-          <w:numId w:val="1039"/>
+          <w:numId w:val="1040"/>
         </w:numPr>
         <w:pStyle w:val="Compact"/>
       </w:pPr>
@@ -7795,9 +8109,9 @@
         </w:pict>
       </w:r>
     </w:p>
-    <w:bookmarkEnd w:id="75"/>
-    <w:bookmarkEnd w:id="76"/>
-    <w:bookmarkStart w:id="83" w:name="common-patterns-across-the-app"/>
+    <w:bookmarkEnd w:id="77"/>
+    <w:bookmarkEnd w:id="78"/>
+    <w:bookmarkStart w:id="85" w:name="common-patterns-across-the-app"/>
     <w:p>
       <w:pPr>
         <w:pStyle w:val="Heading2"/>
@@ -7814,7 +8128,7 @@
         <w:t xml:space="preserve">A few habits the app uses everywhere — once you know them, the whole app feels easier.</w:t>
       </w:r>
     </w:p>
-    <w:bookmarkStart w:id="77" w:name="the--new-button"/>
+    <w:bookmarkStart w:id="79" w:name="the--new-button"/>
     <w:p>
       <w:pPr>
         <w:pStyle w:val="Heading3"/>
@@ -7847,8 +8161,8 @@
         <w:t xml:space="preserve">button beside the dropdown. Click it, fill in the popup, save, and you're back where you started with the new item selected. This works for donors, contacts, addresses, vehicles, agencies, corporate facilities — anywhere a record might not exist yet.</w:t>
       </w:r>
     </w:p>
-    <w:bookmarkEnd w:id="77"/>
-    <w:bookmarkStart w:id="78" w:name="required-fields"/>
+    <w:bookmarkEnd w:id="79"/>
+    <w:bookmarkStart w:id="80" w:name="required-fields"/>
     <w:p>
       <w:pPr>
         <w:pStyle w:val="Heading3"/>
@@ -7874,8 +8188,8 @@
         <w:t xml:space="preserve">) next to a field label means it's required. If you try to save without filling it in, the field will turn red and the form will tell you what's missing.</w:t>
       </w:r>
     </w:p>
-    <w:bookmarkEnd w:id="78"/>
-    <w:bookmarkStart w:id="79" w:name="search-bars"/>
+    <w:bookmarkEnd w:id="80"/>
+    <w:bookmarkStart w:id="81" w:name="search-bars"/>
     <w:p>
       <w:pPr>
         <w:pStyle w:val="Heading3"/>
@@ -7892,8 +8206,8 @@
         <w:t xml:space="preserve">Every list page has a search bar at the top. It searches across all visible columns — name, email, date, status, whatever. There's no need to click "Search" — results filter as you type.</w:t>
       </w:r>
     </w:p>
-    <w:bookmarkEnd w:id="79"/>
-    <w:bookmarkStart w:id="80" w:name="prev--next-navigation"/>
+    <w:bookmarkEnd w:id="81"/>
+    <w:bookmarkStart w:id="82" w:name="prev--next-navigation"/>
     <w:p>
       <w:pPr>
         <w:pStyle w:val="Heading3"/>
@@ -7942,8 +8256,8 @@
         <w:t xml:space="preserve">buttons at the top. They walk you through records one at a time in the order they appear in the list — useful for batch tasks like reviewing all unacknowledged donations.</w:t>
       </w:r>
     </w:p>
-    <w:bookmarkEnd w:id="80"/>
-    <w:bookmarkStart w:id="81" w:name="unsaved-changes-warning"/>
+    <w:bookmarkEnd w:id="82"/>
+    <w:bookmarkStart w:id="83" w:name="unsaved-changes-warning"/>
     <w:p>
       <w:pPr>
         <w:pStyle w:val="Heading3"/>
@@ -7992,8 +8306,8 @@
         <w:t xml:space="preserve">to leave.</w:t>
       </w:r>
     </w:p>
-    <w:bookmarkEnd w:id="81"/>
-    <w:bookmarkStart w:id="82" w:name="audit-log"/>
+    <w:bookmarkEnd w:id="83"/>
+    <w:bookmarkStart w:id="84" w:name="audit-log"/>
     <w:p>
       <w:pPr>
         <w:pStyle w:val="Heading3"/>
@@ -8033,9 +8347,9 @@
         </w:pict>
       </w:r>
     </w:p>
-    <w:bookmarkEnd w:id="82"/>
-    <w:bookmarkEnd w:id="83"/>
-    <w:bookmarkStart w:id="90" w:name="troubleshooting--getting-help"/>
+    <w:bookmarkEnd w:id="84"/>
+    <w:bookmarkEnd w:id="85"/>
+    <w:bookmarkStart w:id="92" w:name="troubleshooting--getting-help"/>
     <w:p>
       <w:pPr>
         <w:pStyle w:val="Heading2"/>
@@ -8044,7 +8358,7 @@
         <w:t xml:space="preserve">Troubleshooting &amp; Getting Help</w:t>
       </w:r>
     </w:p>
-    <w:bookmarkStart w:id="84" w:name="i-cant-see-something-i-just-created"/>
+    <w:bookmarkStart w:id="86" w:name="i-cant-see-something-i-just-created"/>
     <w:p>
       <w:pPr>
         <w:pStyle w:val="Heading3"/>
@@ -8057,7 +8371,7 @@
       <w:pPr>
         <w:numPr>
           <w:ilvl w:val="0"/>
-          <w:numId w:val="1040"/>
+          <w:numId w:val="1041"/>
         </w:numPr>
         <w:pStyle w:val="Compact"/>
       </w:pPr>
@@ -8079,7 +8393,7 @@
       <w:pPr>
         <w:numPr>
           <w:ilvl w:val="0"/>
-          <w:numId w:val="1040"/>
+          <w:numId w:val="1041"/>
         </w:numPr>
         <w:pStyle w:val="Compact"/>
       </w:pPr>
@@ -8097,8 +8411,8 @@
         <w:t xml:space="preserve">— many list pages have status filters at the top. You might be viewing only "Active" while your record is "Pending."</w:t>
       </w:r>
     </w:p>
-    <w:bookmarkEnd w:id="84"/>
-    <w:bookmarkStart w:id="85" w:name="sync-now-did-nothing"/>
+    <w:bookmarkEnd w:id="86"/>
+    <w:bookmarkStart w:id="87" w:name="sync-now-did-nothing"/>
     <w:p>
       <w:pPr>
         <w:pStyle w:val="Heading3"/>
@@ -8111,7 +8425,7 @@
       <w:pPr>
         <w:numPr>
           <w:ilvl w:val="0"/>
-          <w:numId w:val="1041"/>
+          <w:numId w:val="1042"/>
         </w:numPr>
         <w:pStyle w:val="Compact"/>
       </w:pPr>
@@ -8119,8 +8433,8 @@
         <w:t xml:space="preserve">That just means there's no new mail since the last sync. It's normal.</w:t>
       </w:r>
     </w:p>
-    <w:bookmarkEnd w:id="85"/>
-    <w:bookmarkStart w:id="86" w:name="the-page-wont-load--im-seeing-an-error"/>
+    <w:bookmarkEnd w:id="87"/>
+    <w:bookmarkStart w:id="88" w:name="the-page-wont-load--im-seeing-an-error"/>
     <w:p>
       <w:pPr>
         <w:pStyle w:val="Heading3"/>
@@ -8133,7 +8447,7 @@
       <w:pPr>
         <w:numPr>
           <w:ilvl w:val="0"/>
-          <w:numId w:val="1042"/>
+          <w:numId w:val="1043"/>
         </w:numPr>
         <w:pStyle w:val="Compact"/>
       </w:pPr>
@@ -8161,7 +8475,7 @@
       <w:pPr>
         <w:numPr>
           <w:ilvl w:val="0"/>
-          <w:numId w:val="1042"/>
+          <w:numId w:val="1043"/>
         </w:numPr>
         <w:pStyle w:val="Compact"/>
       </w:pPr>
@@ -8173,7 +8487,7 @@
       <w:pPr>
         <w:numPr>
           <w:ilvl w:val="0"/>
-          <w:numId w:val="1042"/>
+          <w:numId w:val="1043"/>
         </w:numPr>
         <w:pStyle w:val="Compact"/>
       </w:pPr>
@@ -8181,8 +8495,8 @@
         <w:t xml:space="preserve">If still broken, take a screenshot of the error and send it to your admin.</w:t>
       </w:r>
     </w:p>
-    <w:bookmarkEnd w:id="86"/>
-    <w:bookmarkStart w:id="87" w:name="i-deleted-something-by-accident"/>
+    <w:bookmarkEnd w:id="88"/>
+    <w:bookmarkStart w:id="89" w:name="i-deleted-something-by-accident"/>
     <w:p>
       <w:pPr>
         <w:pStyle w:val="Heading3"/>
@@ -8195,7 +8509,7 @@
       <w:pPr>
         <w:numPr>
           <w:ilvl w:val="0"/>
-          <w:numId w:val="1043"/>
+          <w:numId w:val="1044"/>
         </w:numPr>
         <w:pStyle w:val="Compact"/>
       </w:pPr>
@@ -8203,8 +8517,8 @@
         <w:t xml:space="preserve">Tell your admin — most things can be restored from the audit log. Don't try to recreate it yet; let admin recover the original.</w:t>
       </w:r>
     </w:p>
-    <w:bookmarkEnd w:id="87"/>
-    <w:bookmarkStart w:id="89" w:name="how-to-report-a-bug"/>
+    <w:bookmarkEnd w:id="89"/>
+    <w:bookmarkStart w:id="91" w:name="how-to-report-a-bug"/>
     <w:p>
       <w:pPr>
         <w:pStyle w:val="Heading3"/>
@@ -8223,8 +8537,8 @@
       <w:r>
         <w:t xml:space="preserve"> </w:t>
       </w:r>
-      <w:hyperlink r:id="rId88">
-        <w:hyperlink r:id="rId88">
+      <w:hyperlink r:id="rId90">
+        <w:hyperlink r:id="rId90">
           <w:r>
             <w:rPr>
               <w:rStyle w:val="Hyperlink"/>
@@ -8241,7 +8555,7 @@
       <w:pPr>
         <w:numPr>
           <w:ilvl w:val="0"/>
-          <w:numId w:val="1044"/>
+          <w:numId w:val="1045"/>
         </w:numPr>
         <w:pStyle w:val="Compact"/>
       </w:pPr>
@@ -8263,7 +8577,7 @@
       <w:pPr>
         <w:numPr>
           <w:ilvl w:val="0"/>
-          <w:numId w:val="1044"/>
+          <w:numId w:val="1045"/>
         </w:numPr>
         <w:pStyle w:val="Compact"/>
       </w:pPr>
@@ -8285,7 +8599,7 @@
       <w:pPr>
         <w:numPr>
           <w:ilvl w:val="0"/>
-          <w:numId w:val="1044"/>
+          <w:numId w:val="1045"/>
         </w:numPr>
         <w:pStyle w:val="Compact"/>
       </w:pPr>
@@ -8307,7 +8621,7 @@
       <w:pPr>
         <w:numPr>
           <w:ilvl w:val="0"/>
-          <w:numId w:val="1044"/>
+          <w:numId w:val="1045"/>
         </w:numPr>
         <w:pStyle w:val="Compact"/>
       </w:pPr>
@@ -8332,10 +8646,10 @@
         </w:pict>
       </w:r>
     </w:p>
-    <w:bookmarkEnd w:id="89"/>
-    <w:bookmarkEnd w:id="90"/>
     <w:bookmarkEnd w:id="91"/>
-    <w:bookmarkStart w:id="115" w:name="appendix-a--administrator-guide"/>
+    <w:bookmarkEnd w:id="92"/>
+    <w:bookmarkEnd w:id="93"/>
+    <w:bookmarkStart w:id="117" w:name="appendix-a--administrator-guide"/>
     <w:p>
       <w:pPr>
         <w:pStyle w:val="Heading1"/>
@@ -8384,7 +8698,7 @@
         <w:t xml:space="preserve">section of the sidebar plus the org-wide settings only admins can change.</w:t>
       </w:r>
     </w:p>
-    <w:bookmarkStart w:id="92" w:name="whats-in-the-admin-section"/>
+    <w:bookmarkStart w:id="94" w:name="whats-in-the-admin-section"/>
     <w:p>
       <w:pPr>
         <w:pStyle w:val="Heading2"/>
@@ -8428,8 +8742,8 @@
         <w:t xml:space="preserve">[Screenshot: admin-home.png — the admin landing page with the list of tables grouped by purpose.]</w:t>
       </w:r>
     </w:p>
-    <w:bookmarkEnd w:id="92"/>
-    <w:bookmarkStart w:id="106" w:name="common-admin-tasks"/>
+    <w:bookmarkEnd w:id="94"/>
+    <w:bookmarkStart w:id="108" w:name="common-admin-tasks"/>
     <w:p>
       <w:pPr>
         <w:pStyle w:val="Heading2"/>
@@ -8438,7 +8752,7 @@
         <w:t xml:space="preserve">Common admin tasks</w:t>
       </w:r>
     </w:p>
-    <w:bookmarkStart w:id="93" w:name="adding-a-new-user-account"/>
+    <w:bookmarkStart w:id="95" w:name="adding-a-new-user-account"/>
     <w:p>
       <w:pPr>
         <w:pStyle w:val="Heading3"/>
@@ -8451,7 +8765,7 @@
       <w:pPr>
         <w:numPr>
           <w:ilvl w:val="0"/>
-          <w:numId w:val="1045"/>
+          <w:numId w:val="1046"/>
         </w:numPr>
         <w:pStyle w:val="Compact"/>
       </w:pPr>
@@ -8492,7 +8806,7 @@
       <w:pPr>
         <w:numPr>
           <w:ilvl w:val="0"/>
-          <w:numId w:val="1045"/>
+          <w:numId w:val="1046"/>
         </w:numPr>
         <w:pStyle w:val="Compact"/>
       </w:pPr>
@@ -8520,7 +8834,7 @@
       <w:pPr>
         <w:numPr>
           <w:ilvl w:val="0"/>
-          <w:numId w:val="1045"/>
+          <w:numId w:val="1046"/>
         </w:numPr>
         <w:pStyle w:val="Compact"/>
       </w:pPr>
@@ -8545,7 +8859,7 @@
       <w:pPr>
         <w:numPr>
           <w:ilvl w:val="0"/>
-          <w:numId w:val="1045"/>
+          <w:numId w:val="1046"/>
         </w:numPr>
         <w:pStyle w:val="Compact"/>
       </w:pPr>
@@ -8573,7 +8887,7 @@
       <w:pPr>
         <w:numPr>
           <w:ilvl w:val="0"/>
-          <w:numId w:val="1045"/>
+          <w:numId w:val="1046"/>
         </w:numPr>
         <w:pStyle w:val="Compact"/>
       </w:pPr>
@@ -8581,8 +8895,8 @@
         <w:t xml:space="preserve">Tell the new user their email + temporary password. They'll be forced to change it on first login.</w:t>
       </w:r>
     </w:p>
-    <w:bookmarkEnd w:id="93"/>
-    <w:bookmarkStart w:id="94" w:name="resetting-a-users-password"/>
+    <w:bookmarkEnd w:id="95"/>
+    <w:bookmarkStart w:id="96" w:name="resetting-a-users-password"/>
     <w:p>
       <w:pPr>
         <w:pStyle w:val="Heading3"/>
@@ -8595,7 +8909,7 @@
       <w:pPr>
         <w:numPr>
           <w:ilvl w:val="0"/>
-          <w:numId w:val="1046"/>
+          <w:numId w:val="1047"/>
         </w:numPr>
         <w:pStyle w:val="Compact"/>
       </w:pPr>
@@ -8636,7 +8950,7 @@
       <w:pPr>
         <w:numPr>
           <w:ilvl w:val="0"/>
-          <w:numId w:val="1046"/>
+          <w:numId w:val="1047"/>
         </w:numPr>
         <w:pStyle w:val="Compact"/>
       </w:pPr>
@@ -8661,7 +8975,7 @@
       <w:pPr>
         <w:numPr>
           <w:ilvl w:val="0"/>
-          <w:numId w:val="1046"/>
+          <w:numId w:val="1047"/>
         </w:numPr>
         <w:pStyle w:val="Compact"/>
       </w:pPr>
@@ -8669,8 +8983,8 @@
         <w:t xml:space="preserve">Copy the new temporary password and pass it to the user.</w:t>
       </w:r>
     </w:p>
-    <w:bookmarkEnd w:id="94"/>
-    <w:bookmarkStart w:id="95" w:name="disabling-a-user-account"/>
+    <w:bookmarkEnd w:id="96"/>
+    <w:bookmarkStart w:id="97" w:name="disabling-a-user-account"/>
     <w:p>
       <w:pPr>
         <w:pStyle w:val="Heading3"/>
@@ -8707,7 +9021,7 @@
       <w:pPr>
         <w:numPr>
           <w:ilvl w:val="0"/>
-          <w:numId w:val="1047"/>
+          <w:numId w:val="1048"/>
         </w:numPr>
         <w:pStyle w:val="Compact"/>
       </w:pPr>
@@ -8748,7 +9062,7 @@
       <w:pPr>
         <w:numPr>
           <w:ilvl w:val="0"/>
-          <w:numId w:val="1047"/>
+          <w:numId w:val="1048"/>
         </w:numPr>
         <w:pStyle w:val="Compact"/>
       </w:pPr>
@@ -8776,7 +9090,7 @@
       <w:pPr>
         <w:numPr>
           <w:ilvl w:val="0"/>
-          <w:numId w:val="1047"/>
+          <w:numId w:val="1048"/>
         </w:numPr>
         <w:pStyle w:val="Compact"/>
       </w:pPr>
@@ -8784,8 +9098,8 @@
         <w:t xml:space="preserve">Save.</w:t>
       </w:r>
     </w:p>
-    <w:bookmarkEnd w:id="95"/>
-    <w:bookmarkStart w:id="96" w:name="viewing-the-audit-log"/>
+    <w:bookmarkEnd w:id="97"/>
+    <w:bookmarkStart w:id="98" w:name="viewing-the-audit-log"/>
     <w:p>
       <w:pPr>
         <w:pStyle w:val="Heading3"/>
@@ -8798,7 +9112,7 @@
       <w:pPr>
         <w:numPr>
           <w:ilvl w:val="0"/>
-          <w:numId w:val="1048"/>
+          <w:numId w:val="1049"/>
         </w:numPr>
         <w:pStyle w:val="Compact"/>
       </w:pPr>
@@ -8823,7 +9137,7 @@
       <w:pPr>
         <w:numPr>
           <w:ilvl w:val="0"/>
-          <w:numId w:val="1048"/>
+          <w:numId w:val="1049"/>
         </w:numPr>
         <w:pStyle w:val="Compact"/>
       </w:pPr>
@@ -8835,7 +9149,7 @@
       <w:pPr>
         <w:numPr>
           <w:ilvl w:val="0"/>
-          <w:numId w:val="1048"/>
+          <w:numId w:val="1049"/>
         </w:numPr>
         <w:pStyle w:val="Compact"/>
       </w:pPr>
@@ -8910,8 +9224,8 @@
         <w:t xml:space="preserve">Glance at the audit log once a week. It's how you'll catch accidental deletions, unauthorized changes, or staff confusion.</w:t>
       </w:r>
     </w:p>
-    <w:bookmarkEnd w:id="96"/>
-    <w:bookmarkStart w:id="97" w:name="editing-lookup-tables"/>
+    <w:bookmarkEnd w:id="98"/>
+    <w:bookmarkStart w:id="99" w:name="editing-lookup-tables"/>
     <w:p>
       <w:pPr>
         <w:pStyle w:val="Heading3"/>
@@ -8944,7 +9258,7 @@
       <w:pPr>
         <w:numPr>
           <w:ilvl w:val="0"/>
-          <w:numId w:val="1049"/>
+          <w:numId w:val="1050"/>
         </w:numPr>
         <w:pStyle w:val="Compact"/>
       </w:pPr>
@@ -8968,7 +9282,7 @@
       <w:pPr>
         <w:numPr>
           <w:ilvl w:val="0"/>
-          <w:numId w:val="1049"/>
+          <w:numId w:val="1050"/>
         </w:numPr>
         <w:pStyle w:val="Compact"/>
       </w:pPr>
@@ -8980,7 +9294,7 @@
       <w:pPr>
         <w:numPr>
           <w:ilvl w:val="0"/>
-          <w:numId w:val="1049"/>
+          <w:numId w:val="1050"/>
         </w:numPr>
         <w:pStyle w:val="Compact"/>
       </w:pPr>
@@ -9012,8 +9326,8 @@
         <w:t xml:space="preserve">If any record references that entry, deleting will fail (the app protects you). Instead, mark it inactive if the table has an active flag.</w:t>
       </w:r>
     </w:p>
-    <w:bookmarkEnd w:id="97"/>
-    <w:bookmarkStart w:id="99" w:name="managing-the-packing-list-template"/>
+    <w:bookmarkEnd w:id="99"/>
+    <w:bookmarkStart w:id="101" w:name="managing-the-packing-list-template"/>
     <w:p>
       <w:pPr>
         <w:pStyle w:val="Heading3"/>
@@ -9034,7 +9348,7 @@
       <w:pPr>
         <w:numPr>
           <w:ilvl w:val="0"/>
-          <w:numId w:val="1050"/>
+          <w:numId w:val="1051"/>
         </w:numPr>
         <w:pStyle w:val="Compact"/>
       </w:pPr>
@@ -9101,7 +9415,7 @@
       <w:pPr>
         <w:numPr>
           <w:ilvl w:val="0"/>
-          <w:numId w:val="1050"/>
+          <w:numId w:val="1051"/>
         </w:numPr>
         <w:pStyle w:val="Compact"/>
       </w:pPr>
@@ -9273,7 +9587,7 @@
         <w:t xml:space="preserve">). You'll rarely edit these directly — the packing list form is the right place — but they're there if you need to correct data in bulk.</w:t>
       </w:r>
     </w:p>
-    <w:bookmarkStart w:id="98" w:name="new-packing-list-fields-for-reference"/>
+    <w:bookmarkStart w:id="100" w:name="new-packing-list-fields-for-reference"/>
     <w:p>
       <w:pPr>
         <w:pStyle w:val="Heading4"/>
@@ -9558,9 +9872,9 @@
         <w:t xml:space="preserve">).</w:t>
       </w:r>
     </w:p>
-    <w:bookmarkEnd w:id="98"/>
-    <w:bookmarkEnd w:id="99"/>
-    <w:bookmarkStart w:id="100" w:name="shift-templates"/>
+    <w:bookmarkEnd w:id="100"/>
+    <w:bookmarkEnd w:id="101"/>
+    <w:bookmarkStart w:id="102" w:name="shift-templates"/>
     <w:p>
       <w:pPr>
         <w:pStyle w:val="Heading3"/>
@@ -9597,7 +9911,7 @@
       <w:pPr>
         <w:numPr>
           <w:ilvl w:val="0"/>
-          <w:numId w:val="1051"/>
+          <w:numId w:val="1052"/>
         </w:numPr>
         <w:pStyle w:val="Compact"/>
       </w:pPr>
@@ -9638,7 +9952,7 @@
       <w:pPr>
         <w:numPr>
           <w:ilvl w:val="0"/>
-          <w:numId w:val="1051"/>
+          <w:numId w:val="1052"/>
         </w:numPr>
         <w:pStyle w:val="Compact"/>
       </w:pPr>
@@ -9698,7 +10012,7 @@
       <w:pPr>
         <w:numPr>
           <w:ilvl w:val="0"/>
-          <w:numId w:val="1051"/>
+          <w:numId w:val="1052"/>
         </w:numPr>
         <w:pStyle w:val="Compact"/>
       </w:pPr>
@@ -9710,7 +10024,7 @@
       <w:pPr>
         <w:numPr>
           <w:ilvl w:val="0"/>
-          <w:numId w:val="1051"/>
+          <w:numId w:val="1052"/>
         </w:numPr>
         <w:pStyle w:val="Compact"/>
       </w:pPr>
@@ -9738,7 +10052,7 @@
       <w:pPr>
         <w:numPr>
           <w:ilvl w:val="0"/>
-          <w:numId w:val="1051"/>
+          <w:numId w:val="1052"/>
         </w:numPr>
         <w:pStyle w:val="Compact"/>
       </w:pPr>
@@ -9781,8 +10095,8 @@
         <w:t xml:space="preserve">[Screenshot: shift-templates-list.png — the shift templates admin list.]</w:t>
       </w:r>
     </w:p>
-    <w:bookmarkEnd w:id="100"/>
-    <w:bookmarkStart w:id="101" w:name="holidays"/>
+    <w:bookmarkEnd w:id="102"/>
+    <w:bookmarkStart w:id="103" w:name="holidays"/>
     <w:p>
       <w:pPr>
         <w:pStyle w:val="Heading3"/>
@@ -9803,7 +10117,7 @@
       <w:pPr>
         <w:numPr>
           <w:ilvl w:val="0"/>
-          <w:numId w:val="1052"/>
+          <w:numId w:val="1053"/>
         </w:numPr>
         <w:pStyle w:val="Compact"/>
       </w:pPr>
@@ -9825,7 +10139,7 @@
       <w:pPr>
         <w:numPr>
           <w:ilvl w:val="0"/>
-          <w:numId w:val="1052"/>
+          <w:numId w:val="1053"/>
         </w:numPr>
         <w:pStyle w:val="Compact"/>
       </w:pPr>
@@ -9880,8 +10194,8 @@
         <w:t xml:space="preserve">.</w:t>
       </w:r>
     </w:p>
-    <w:bookmarkEnd w:id="101"/>
-    <w:bookmarkStart w:id="102" w:name="org-settings"/>
+    <w:bookmarkEnd w:id="103"/>
+    <w:bookmarkStart w:id="104" w:name="org-settings"/>
     <w:p>
       <w:pPr>
         <w:pStyle w:val="Heading3"/>
@@ -9918,7 +10232,7 @@
       <w:pPr>
         <w:numPr>
           <w:ilvl w:val="0"/>
-          <w:numId w:val="1053"/>
+          <w:numId w:val="1054"/>
         </w:numPr>
         <w:pStyle w:val="Compact"/>
       </w:pPr>
@@ -9930,7 +10244,7 @@
       <w:pPr>
         <w:numPr>
           <w:ilvl w:val="0"/>
-          <w:numId w:val="1053"/>
+          <w:numId w:val="1054"/>
         </w:numPr>
         <w:pStyle w:val="Compact"/>
       </w:pPr>
@@ -9942,7 +10256,7 @@
       <w:pPr>
         <w:numPr>
           <w:ilvl w:val="0"/>
-          <w:numId w:val="1053"/>
+          <w:numId w:val="1054"/>
         </w:numPr>
         <w:pStyle w:val="Compact"/>
       </w:pPr>
@@ -9954,7 +10268,7 @@
       <w:pPr>
         <w:numPr>
           <w:ilvl w:val="0"/>
-          <w:numId w:val="1053"/>
+          <w:numId w:val="1054"/>
         </w:numPr>
         <w:pStyle w:val="Compact"/>
       </w:pPr>
@@ -9966,7 +10280,7 @@
       <w:pPr>
         <w:numPr>
           <w:ilvl w:val="0"/>
-          <w:numId w:val="1053"/>
+          <w:numId w:val="1054"/>
         </w:numPr>
         <w:pStyle w:val="Compact"/>
       </w:pPr>
@@ -9993,8 +10307,8 @@
         <w:t xml:space="preserve">[Screenshot: org-settings.png — the Org Settings page with all fields filled in.]</w:t>
       </w:r>
     </w:p>
-    <w:bookmarkEnd w:id="102"/>
-    <w:bookmarkStart w:id="103" w:name="email-account-setup-per-user"/>
+    <w:bookmarkEnd w:id="104"/>
+    <w:bookmarkStart w:id="105" w:name="email-account-setup-per-user"/>
     <w:p>
       <w:pPr>
         <w:pStyle w:val="Heading3"/>
@@ -10049,7 +10363,7 @@
       <w:pPr>
         <w:numPr>
           <w:ilvl w:val="0"/>
-          <w:numId w:val="1054"/>
+          <w:numId w:val="1055"/>
         </w:numPr>
         <w:pStyle w:val="Compact"/>
       </w:pPr>
@@ -10071,7 +10385,7 @@
       <w:pPr>
         <w:numPr>
           <w:ilvl w:val="0"/>
-          <w:numId w:val="1054"/>
+          <w:numId w:val="1055"/>
         </w:numPr>
         <w:pStyle w:val="Compact"/>
       </w:pPr>
@@ -10093,7 +10407,7 @@
       <w:pPr>
         <w:numPr>
           <w:ilvl w:val="0"/>
-          <w:numId w:val="1054"/>
+          <w:numId w:val="1055"/>
         </w:numPr>
         <w:pStyle w:val="Compact"/>
       </w:pPr>
@@ -10135,8 +10449,8 @@
         <w:t xml:space="preserve">in our database (AES-256).</w:t>
       </w:r>
     </w:p>
-    <w:bookmarkEnd w:id="103"/>
-    <w:bookmarkStart w:id="104" w:name="quickbooks-setup"/>
+    <w:bookmarkEnd w:id="105"/>
+    <w:bookmarkStart w:id="106" w:name="quickbooks-setup"/>
     <w:p>
       <w:pPr>
         <w:pStyle w:val="Heading3"/>
@@ -10157,7 +10471,7 @@
       <w:pPr>
         <w:numPr>
           <w:ilvl w:val="0"/>
-          <w:numId w:val="1055"/>
+          <w:numId w:val="1056"/>
         </w:numPr>
         <w:pStyle w:val="Compact"/>
       </w:pPr>
@@ -10198,7 +10512,7 @@
       <w:pPr>
         <w:numPr>
           <w:ilvl w:val="0"/>
-          <w:numId w:val="1055"/>
+          <w:numId w:val="1056"/>
         </w:numPr>
         <w:pStyle w:val="Compact"/>
       </w:pPr>
@@ -10210,7 +10524,7 @@
       <w:pPr>
         <w:numPr>
           <w:ilvl w:val="0"/>
-          <w:numId w:val="1055"/>
+          <w:numId w:val="1056"/>
         </w:numPr>
         <w:pStyle w:val="Compact"/>
       </w:pPr>
@@ -10222,7 +10536,7 @@
       <w:pPr>
         <w:numPr>
           <w:ilvl w:val="0"/>
-          <w:numId w:val="1055"/>
+          <w:numId w:val="1056"/>
         </w:numPr>
         <w:pStyle w:val="Compact"/>
       </w:pPr>
@@ -10266,7 +10580,7 @@
       <w:pPr>
         <w:numPr>
           <w:ilvl w:val="0"/>
-          <w:numId w:val="1055"/>
+          <w:numId w:val="1056"/>
         </w:numPr>
         <w:pStyle w:val="Compact"/>
       </w:pPr>
@@ -10306,8 +10620,8 @@
         <w:t xml:space="preserve">[Screenshot: qbo-mappings.png — the QuickBooks fund mapping page.]</w:t>
       </w:r>
     </w:p>
-    <w:bookmarkEnd w:id="104"/>
-    <w:bookmarkStart w:id="105" w:name="storage-settings-attachments"/>
+    <w:bookmarkEnd w:id="106"/>
+    <w:bookmarkStart w:id="107" w:name="storage-settings-attachments"/>
     <w:p>
       <w:pPr>
         <w:pStyle w:val="Heading3"/>
@@ -10344,7 +10658,7 @@
       <w:pPr>
         <w:numPr>
           <w:ilvl w:val="0"/>
-          <w:numId w:val="1056"/>
+          <w:numId w:val="1057"/>
         </w:numPr>
         <w:pStyle w:val="Compact"/>
       </w:pPr>
@@ -10369,7 +10683,7 @@
       <w:pPr>
         <w:numPr>
           <w:ilvl w:val="0"/>
-          <w:numId w:val="1056"/>
+          <w:numId w:val="1057"/>
         </w:numPr>
         <w:pStyle w:val="Compact"/>
       </w:pPr>
@@ -10381,7 +10695,7 @@
       <w:pPr>
         <w:numPr>
           <w:ilvl w:val="0"/>
-          <w:numId w:val="1056"/>
+          <w:numId w:val="1057"/>
         </w:numPr>
         <w:pStyle w:val="Compact"/>
       </w:pPr>
@@ -10420,9 +10734,9 @@
         </w:pict>
       </w:r>
     </w:p>
-    <w:bookmarkEnd w:id="105"/>
-    <w:bookmarkEnd w:id="106"/>
-    <w:bookmarkStart w:id="113" w:name="X8dbbb4fa423216788383cf5d23dd16056f3028b"/>
+    <w:bookmarkEnd w:id="107"/>
+    <w:bookmarkEnd w:id="108"/>
+    <w:bookmarkStart w:id="115" w:name="X8dbbb4fa423216788383cf5d23dd16056f3028b"/>
     <w:p>
       <w:pPr>
         <w:pStyle w:val="Heading2"/>
@@ -10439,7 +10753,7 @@
         <w:t xml:space="preserve">A few habits that prevent future headaches:</w:t>
       </w:r>
     </w:p>
-    <w:bookmarkStart w:id="107" w:name="once-a-week"/>
+    <w:bookmarkStart w:id="109" w:name="once-a-week"/>
     <w:p>
       <w:pPr>
         <w:pStyle w:val="Heading3"/>
@@ -10452,7 +10766,7 @@
       <w:pPr>
         <w:numPr>
           <w:ilvl w:val="0"/>
-          <w:numId w:val="1057"/>
+          <w:numId w:val="1058"/>
         </w:numPr>
         <w:pStyle w:val="Compact"/>
       </w:pPr>
@@ -10474,7 +10788,7 @@
       <w:pPr>
         <w:numPr>
           <w:ilvl w:val="0"/>
-          <w:numId w:val="1057"/>
+          <w:numId w:val="1058"/>
         </w:numPr>
         <w:pStyle w:val="Compact"/>
       </w:pPr>
@@ -10496,7 +10810,7 @@
       <w:pPr>
         <w:numPr>
           <w:ilvl w:val="0"/>
-          <w:numId w:val="1057"/>
+          <w:numId w:val="1058"/>
         </w:numPr>
         <w:pStyle w:val="Compact"/>
       </w:pPr>
@@ -10514,8 +10828,8 @@
         <w:t xml:space="preserve">— make sure your IMAP connection is still healthy.</w:t>
       </w:r>
     </w:p>
-    <w:bookmarkEnd w:id="107"/>
-    <w:bookmarkStart w:id="108" w:name="once-a-month"/>
+    <w:bookmarkEnd w:id="109"/>
+    <w:bookmarkStart w:id="110" w:name="once-a-month"/>
     <w:p>
       <w:pPr>
         <w:pStyle w:val="Heading3"/>
@@ -10528,7 +10842,7 @@
       <w:pPr>
         <w:numPr>
           <w:ilvl w:val="0"/>
-          <w:numId w:val="1058"/>
+          <w:numId w:val="1059"/>
         </w:numPr>
         <w:pStyle w:val="Compact"/>
       </w:pPr>
@@ -10550,7 +10864,7 @@
       <w:pPr>
         <w:numPr>
           <w:ilvl w:val="0"/>
-          <w:numId w:val="1058"/>
+          <w:numId w:val="1059"/>
         </w:numPr>
         <w:pStyle w:val="Compact"/>
       </w:pPr>
@@ -10572,7 +10886,7 @@
       <w:pPr>
         <w:numPr>
           <w:ilvl w:val="0"/>
-          <w:numId w:val="1058"/>
+          <w:numId w:val="1059"/>
         </w:numPr>
         <w:pStyle w:val="Compact"/>
       </w:pPr>
@@ -10605,8 +10919,8 @@
         <w:t xml:space="preserve">from the Postgres docs we've documented.</w:t>
       </w:r>
     </w:p>
-    <w:bookmarkEnd w:id="108"/>
-    <w:bookmarkStart w:id="109" w:name="once-a-quarter"/>
+    <w:bookmarkEnd w:id="110"/>
+    <w:bookmarkStart w:id="111" w:name="once-a-quarter"/>
     <w:p>
       <w:pPr>
         <w:pStyle w:val="Heading3"/>
@@ -10619,7 +10933,7 @@
       <w:pPr>
         <w:numPr>
           <w:ilvl w:val="0"/>
-          <w:numId w:val="1059"/>
+          <w:numId w:val="1060"/>
         </w:numPr>
         <w:pStyle w:val="Compact"/>
       </w:pPr>
@@ -10641,7 +10955,7 @@
       <w:pPr>
         <w:numPr>
           <w:ilvl w:val="0"/>
-          <w:numId w:val="1059"/>
+          <w:numId w:val="1060"/>
         </w:numPr>
         <w:pStyle w:val="Compact"/>
       </w:pPr>
@@ -10663,7 +10977,7 @@
       <w:pPr>
         <w:numPr>
           <w:ilvl w:val="0"/>
-          <w:numId w:val="1059"/>
+          <w:numId w:val="1060"/>
         </w:numPr>
         <w:pStyle w:val="Compact"/>
       </w:pPr>
@@ -10681,8 +10995,8 @@
         <w:t xml:space="preserve">— anything outdated? Have we added features that aren't documented?</w:t>
       </w:r>
     </w:p>
-    <w:bookmarkEnd w:id="109"/>
-    <w:bookmarkStart w:id="110" w:name="before-any-board-meeting"/>
+    <w:bookmarkEnd w:id="111"/>
+    <w:bookmarkStart w:id="112" w:name="before-any-board-meeting"/>
     <w:p>
       <w:pPr>
         <w:pStyle w:val="Heading3"/>
@@ -10695,7 +11009,7 @@
       <w:pPr>
         <w:numPr>
           <w:ilvl w:val="0"/>
-          <w:numId w:val="1060"/>
+          <w:numId w:val="1061"/>
         </w:numPr>
         <w:pStyle w:val="Compact"/>
       </w:pPr>
@@ -10717,7 +11031,7 @@
       <w:pPr>
         <w:numPr>
           <w:ilvl w:val="0"/>
-          <w:numId w:val="1060"/>
+          <w:numId w:val="1061"/>
         </w:numPr>
         <w:pStyle w:val="Compact"/>
       </w:pPr>
@@ -10767,8 +11081,8 @@
         <w:t xml:space="preserve">is usually all a board wants.</w:t>
       </w:r>
     </w:p>
-    <w:bookmarkEnd w:id="110"/>
-    <w:bookmarkStart w:id="111" w:name="data-hygiene-tips"/>
+    <w:bookmarkEnd w:id="112"/>
+    <w:bookmarkStart w:id="113" w:name="data-hygiene-tips"/>
     <w:p>
       <w:pPr>
         <w:pStyle w:val="Heading3"/>
@@ -10781,7 +11095,7 @@
       <w:pPr>
         <w:numPr>
           <w:ilvl w:val="0"/>
-          <w:numId w:val="1061"/>
+          <w:numId w:val="1062"/>
         </w:numPr>
         <w:pStyle w:val="Compact"/>
       </w:pPr>
@@ -10803,7 +11117,7 @@
       <w:pPr>
         <w:numPr>
           <w:ilvl w:val="0"/>
-          <w:numId w:val="1061"/>
+          <w:numId w:val="1062"/>
         </w:numPr>
         <w:pStyle w:val="Compact"/>
       </w:pPr>
@@ -10825,7 +11139,7 @@
       <w:pPr>
         <w:numPr>
           <w:ilvl w:val="0"/>
-          <w:numId w:val="1061"/>
+          <w:numId w:val="1062"/>
         </w:numPr>
         <w:pStyle w:val="Compact"/>
       </w:pPr>
@@ -10843,8 +11157,8 @@
         <w:t xml:space="preserve">Stages stop being useful if nobody updates them. Aim for 5 minutes a week.</w:t>
       </w:r>
     </w:p>
-    <w:bookmarkEnd w:id="111"/>
-    <w:bookmarkStart w:id="112" w:name="when-something-feels-broken"/>
+    <w:bookmarkEnd w:id="113"/>
+    <w:bookmarkStart w:id="114" w:name="when-something-feels-broken"/>
     <w:p>
       <w:pPr>
         <w:pStyle w:val="Heading3"/>
@@ -10865,7 +11179,7 @@
       <w:pPr>
         <w:numPr>
           <w:ilvl w:val="0"/>
-          <w:numId w:val="1062"/>
+          <w:numId w:val="1063"/>
         </w:numPr>
         <w:pStyle w:val="Compact"/>
       </w:pPr>
@@ -10893,7 +11207,7 @@
       <w:pPr>
         <w:numPr>
           <w:ilvl w:val="0"/>
-          <w:numId w:val="1062"/>
+          <w:numId w:val="1063"/>
         </w:numPr>
         <w:pStyle w:val="Compact"/>
       </w:pPr>
@@ -10921,7 +11235,7 @@
       <w:pPr>
         <w:numPr>
           <w:ilvl w:val="0"/>
-          <w:numId w:val="1062"/>
+          <w:numId w:val="1063"/>
         </w:numPr>
         <w:pStyle w:val="Compact"/>
       </w:pPr>
@@ -10946,9 +11260,9 @@
         </w:pict>
       </w:r>
     </w:p>
-    <w:bookmarkEnd w:id="112"/>
-    <w:bookmarkEnd w:id="113"/>
-    <w:bookmarkStart w:id="114" w:name="X0f62817cbbacd3982723ea312394c22bfe902e5"/>
+    <w:bookmarkEnd w:id="114"/>
+    <w:bookmarkEnd w:id="115"/>
+    <w:bookmarkStart w:id="116" w:name="X0f62817cbbacd3982723ea312394c22bfe902e5"/>
     <w:p>
       <w:pPr>
         <w:pStyle w:val="Heading2"/>
@@ -10969,7 +11283,7 @@
       <w:pPr>
         <w:numPr>
           <w:ilvl w:val="0"/>
-          <w:numId w:val="1063"/>
+          <w:numId w:val="1064"/>
         </w:numPr>
         <w:pStyle w:val="Compact"/>
       </w:pPr>
@@ -10981,7 +11295,7 @@
       <w:pPr>
         <w:numPr>
           <w:ilvl w:val="0"/>
-          <w:numId w:val="1063"/>
+          <w:numId w:val="1064"/>
         </w:numPr>
         <w:pStyle w:val="Compact"/>
       </w:pPr>
@@ -11019,7 +11333,7 @@
       <w:pPr>
         <w:numPr>
           <w:ilvl w:val="0"/>
-          <w:numId w:val="1063"/>
+          <w:numId w:val="1064"/>
         </w:numPr>
         <w:pStyle w:val="Compact"/>
       </w:pPr>
@@ -11058,7 +11372,7 @@
       <w:pPr>
         <w:numPr>
           <w:ilvl w:val="0"/>
-          <w:numId w:val="1063"/>
+          <w:numId w:val="1064"/>
         </w:numPr>
         <w:pStyle w:val="Compact"/>
       </w:pPr>
@@ -11124,7 +11438,7 @@
       <w:pPr>
         <w:numPr>
           <w:ilvl w:val="0"/>
-          <w:numId w:val="1063"/>
+          <w:numId w:val="1064"/>
         </w:numPr>
         <w:pStyle w:val="Compact"/>
       </w:pPr>
@@ -11154,7 +11468,7 @@
       <w:pPr>
         <w:numPr>
           <w:ilvl w:val="0"/>
-          <w:numId w:val="1064"/>
+          <w:numId w:val="1065"/>
         </w:numPr>
         <w:pStyle w:val="Compact"/>
       </w:pPr>
@@ -11166,7 +11480,7 @@
       <w:pPr>
         <w:numPr>
           <w:ilvl w:val="0"/>
-          <w:numId w:val="1064"/>
+          <w:numId w:val="1065"/>
         </w:numPr>
         <w:pStyle w:val="Compact"/>
       </w:pPr>
@@ -11178,7 +11492,7 @@
       <w:pPr>
         <w:numPr>
           <w:ilvl w:val="0"/>
-          <w:numId w:val="1064"/>
+          <w:numId w:val="1065"/>
         </w:numPr>
         <w:pStyle w:val="Compact"/>
       </w:pPr>
@@ -11235,7 +11549,7 @@
         </w:rPr>
         <w:t xml:space="preserve"> </w:t>
       </w:r>
-      <w:hyperlink r:id="rId88">
+      <w:hyperlink r:id="rId90">
         <w:r>
           <w:rPr>
             <w:rStyle w:val="Hyperlink"/>
@@ -11255,8 +11569,8 @@
         <w:t xml:space="preserve">.</w:t>
       </w:r>
     </w:p>
-    <w:bookmarkEnd w:id="114"/>
-    <w:bookmarkEnd w:id="115"/>
+    <w:bookmarkEnd w:id="116"/>
+    <w:bookmarkEnd w:id="117"/>
     <w:sectPr/>
   </w:body>
 </w:document>
@@ -12008,34 +12322,7 @@
     <w:abstractNumId w:val="991"/>
   </w:num>
   <w:num w:numId="1044">
-    <w:abstractNumId w:val="99411"/>
-    <w:lvlOverride w:ilvl="0">
-      <w:startOverride w:val="1"/>
-    </w:lvlOverride>
-    <w:lvlOverride w:ilvl="1">
-      <w:startOverride w:val="1"/>
-    </w:lvlOverride>
-    <w:lvlOverride w:ilvl="2">
-      <w:startOverride w:val="1"/>
-    </w:lvlOverride>
-    <w:lvlOverride w:ilvl="3">
-      <w:startOverride w:val="1"/>
-    </w:lvlOverride>
-    <w:lvlOverride w:ilvl="4">
-      <w:startOverride w:val="1"/>
-    </w:lvlOverride>
-    <w:lvlOverride w:ilvl="5">
-      <w:startOverride w:val="1"/>
-    </w:lvlOverride>
-    <w:lvlOverride w:ilvl="6">
-      <w:startOverride w:val="1"/>
-    </w:lvlOverride>
-    <w:lvlOverride w:ilvl="7">
-      <w:startOverride w:val="1"/>
-    </w:lvlOverride>
-    <w:lvlOverride w:ilvl="8">
-      <w:startOverride w:val="1"/>
-    </w:lvlOverride>
+    <w:abstractNumId w:val="991"/>
   </w:num>
   <w:num w:numId="1045">
     <w:abstractNumId w:val="99411"/>
@@ -12188,9 +12475,39 @@
     </w:lvlOverride>
   </w:num>
   <w:num w:numId="1050">
+    <w:abstractNumId w:val="99411"/>
+    <w:lvlOverride w:ilvl="0">
+      <w:startOverride w:val="1"/>
+    </w:lvlOverride>
+    <w:lvlOverride w:ilvl="1">
+      <w:startOverride w:val="1"/>
+    </w:lvlOverride>
+    <w:lvlOverride w:ilvl="2">
+      <w:startOverride w:val="1"/>
+    </w:lvlOverride>
+    <w:lvlOverride w:ilvl="3">
+      <w:startOverride w:val="1"/>
+    </w:lvlOverride>
+    <w:lvlOverride w:ilvl="4">
+      <w:startOverride w:val="1"/>
+    </w:lvlOverride>
+    <w:lvlOverride w:ilvl="5">
+      <w:startOverride w:val="1"/>
+    </w:lvlOverride>
+    <w:lvlOverride w:ilvl="6">
+      <w:startOverride w:val="1"/>
+    </w:lvlOverride>
+    <w:lvlOverride w:ilvl="7">
+      <w:startOverride w:val="1"/>
+    </w:lvlOverride>
+    <w:lvlOverride w:ilvl="8">
+      <w:startOverride w:val="1"/>
+    </w:lvlOverride>
+  </w:num>
+  <w:num w:numId="1051">
     <w:abstractNumId w:val="991"/>
   </w:num>
-  <w:num w:numId="1051">
+  <w:num w:numId="1052">
     <w:abstractNumId w:val="99411"/>
     <w:lvlOverride w:ilvl="0">
       <w:startOverride w:val="1"/>
@@ -12219,9 +12536,6 @@
     <w:lvlOverride w:ilvl="8">
       <w:startOverride w:val="1"/>
     </w:lvlOverride>
-  </w:num>
-  <w:num w:numId="1052">
-    <w:abstractNumId w:val="991"/>
   </w:num>
   <w:num w:numId="1053">
     <w:abstractNumId w:val="991"/>
@@ -12230,34 +12544,7 @@
     <w:abstractNumId w:val="991"/>
   </w:num>
   <w:num w:numId="1055">
-    <w:abstractNumId w:val="99411"/>
-    <w:lvlOverride w:ilvl="0">
-      <w:startOverride w:val="1"/>
-    </w:lvlOverride>
-    <w:lvlOverride w:ilvl="1">
-      <w:startOverride w:val="1"/>
-    </w:lvlOverride>
-    <w:lvlOverride w:ilvl="2">
-      <w:startOverride w:val="1"/>
-    </w:lvlOverride>
-    <w:lvlOverride w:ilvl="3">
-      <w:startOverride w:val="1"/>
-    </w:lvlOverride>
-    <w:lvlOverride w:ilvl="4">
-      <w:startOverride w:val="1"/>
-    </w:lvlOverride>
-    <w:lvlOverride w:ilvl="5">
-      <w:startOverride w:val="1"/>
-    </w:lvlOverride>
-    <w:lvlOverride w:ilvl="6">
-      <w:startOverride w:val="1"/>
-    </w:lvlOverride>
-    <w:lvlOverride w:ilvl="7">
-      <w:startOverride w:val="1"/>
-    </w:lvlOverride>
-    <w:lvlOverride w:ilvl="8">
-      <w:startOverride w:val="1"/>
-    </w:lvlOverride>
+    <w:abstractNumId w:val="991"/>
   </w:num>
   <w:num w:numId="1056">
     <w:abstractNumId w:val="99411"/>
@@ -12290,7 +12577,34 @@
     </w:lvlOverride>
   </w:num>
   <w:num w:numId="1057">
-    <w:abstractNumId w:val="991"/>
+    <w:abstractNumId w:val="99411"/>
+    <w:lvlOverride w:ilvl="0">
+      <w:startOverride w:val="1"/>
+    </w:lvlOverride>
+    <w:lvlOverride w:ilvl="1">
+      <w:startOverride w:val="1"/>
+    </w:lvlOverride>
+    <w:lvlOverride w:ilvl="2">
+      <w:startOverride w:val="1"/>
+    </w:lvlOverride>
+    <w:lvlOverride w:ilvl="3">
+      <w:startOverride w:val="1"/>
+    </w:lvlOverride>
+    <w:lvlOverride w:ilvl="4">
+      <w:startOverride w:val="1"/>
+    </w:lvlOverride>
+    <w:lvlOverride w:ilvl="5">
+      <w:startOverride w:val="1"/>
+    </w:lvlOverride>
+    <w:lvlOverride w:ilvl="6">
+      <w:startOverride w:val="1"/>
+    </w:lvlOverride>
+    <w:lvlOverride w:ilvl="7">
+      <w:startOverride w:val="1"/>
+    </w:lvlOverride>
+    <w:lvlOverride w:ilvl="8">
+      <w:startOverride w:val="1"/>
+    </w:lvlOverride>
   </w:num>
   <w:num w:numId="1058">
     <w:abstractNumId w:val="991"/>
@@ -12305,34 +12619,7 @@
     <w:abstractNumId w:val="991"/>
   </w:num>
   <w:num w:numId="1062">
-    <w:abstractNumId w:val="99411"/>
-    <w:lvlOverride w:ilvl="0">
-      <w:startOverride w:val="1"/>
-    </w:lvlOverride>
-    <w:lvlOverride w:ilvl="1">
-      <w:startOverride w:val="1"/>
-    </w:lvlOverride>
-    <w:lvlOverride w:ilvl="2">
-      <w:startOverride w:val="1"/>
-    </w:lvlOverride>
-    <w:lvlOverride w:ilvl="3">
-      <w:startOverride w:val="1"/>
-    </w:lvlOverride>
-    <w:lvlOverride w:ilvl="4">
-      <w:startOverride w:val="1"/>
-    </w:lvlOverride>
-    <w:lvlOverride w:ilvl="5">
-      <w:startOverride w:val="1"/>
-    </w:lvlOverride>
-    <w:lvlOverride w:ilvl="6">
-      <w:startOverride w:val="1"/>
-    </w:lvlOverride>
-    <w:lvlOverride w:ilvl="7">
-      <w:startOverride w:val="1"/>
-    </w:lvlOverride>
-    <w:lvlOverride w:ilvl="8">
-      <w:startOverride w:val="1"/>
-    </w:lvlOverride>
+    <w:abstractNumId w:val="991"/>
   </w:num>
   <w:num w:numId="1063">
     <w:abstractNumId w:val="99411"/>
@@ -12365,6 +12652,36 @@
     </w:lvlOverride>
   </w:num>
   <w:num w:numId="1064">
+    <w:abstractNumId w:val="99411"/>
+    <w:lvlOverride w:ilvl="0">
+      <w:startOverride w:val="1"/>
+    </w:lvlOverride>
+    <w:lvlOverride w:ilvl="1">
+      <w:startOverride w:val="1"/>
+    </w:lvlOverride>
+    <w:lvlOverride w:ilvl="2">
+      <w:startOverride w:val="1"/>
+    </w:lvlOverride>
+    <w:lvlOverride w:ilvl="3">
+      <w:startOverride w:val="1"/>
+    </w:lvlOverride>
+    <w:lvlOverride w:ilvl="4">
+      <w:startOverride w:val="1"/>
+    </w:lvlOverride>
+    <w:lvlOverride w:ilvl="5">
+      <w:startOverride w:val="1"/>
+    </w:lvlOverride>
+    <w:lvlOverride w:ilvl="6">
+      <w:startOverride w:val="1"/>
+    </w:lvlOverride>
+    <w:lvlOverride w:ilvl="7">
+      <w:startOverride w:val="1"/>
+    </w:lvlOverride>
+    <w:lvlOverride w:ilvl="8">
+      <w:startOverride w:val="1"/>
+    </w:lvlOverride>
+  </w:num>
+  <w:num w:numId="1065">
     <w:abstractNumId w:val="991"/>
   </w:num>
 </w:numbering>

</xml_diff>

<commit_message>
feat: Documents card on all record edit forms
Adds the attachments widget (edit-mode only, gated by isNew/id) to Request, Donation, Pledge, Campaign, Event, Delivery, Pickup, Inventory, Vendor, and Volunteer edit forms. Docs updated.

Co-Authored-By: Claude Opus 4.8 <noreply@anthropic.com>

Claude-Session: https://claude.ai/code/session_013BYKQmJmN7nRG7NrvcSEW7
</commit_message>
<xml_diff>
--- a/docs/USER_MANUAL.docx
+++ b/docs/USER_MANUAL.docx
@@ -7055,7 +7055,52 @@
         <w:pStyle w:val="Compact"/>
       </w:pPr>
       <w:r>
-        <w:t xml:space="preserve">Open the record (e.g., a donor's detail page).</w:t>
+        <w:t xml:space="preserve">Open the record — either its</w:t>
+      </w:r>
+      <w:r>
+        <w:t xml:space="preserve"> </w:t>
+      </w:r>
+      <w:r>
+        <w:rPr>
+          <w:bCs/>
+          <w:b/>
+        </w:rPr>
+        <w:t xml:space="preserve">detail/profile page</w:t>
+      </w:r>
+      <w:r>
+        <w:t xml:space="preserve"> </w:t>
+      </w:r>
+      <w:r>
+        <w:t xml:space="preserve">or its</w:t>
+      </w:r>
+      <w:r>
+        <w:t xml:space="preserve"> </w:t>
+      </w:r>
+      <w:r>
+        <w:rPr>
+          <w:bCs/>
+          <w:b/>
+        </w:rPr>
+        <w:t xml:space="preserve">Edit form</w:t>
+      </w:r>
+      <w:r>
+        <w:t xml:space="preserve">. The</w:t>
+      </w:r>
+      <w:r>
+        <w:t xml:space="preserve"> </w:t>
+      </w:r>
+      <w:r>
+        <w:rPr>
+          <w:bCs/>
+          <w:b/>
+        </w:rPr>
+        <w:t xml:space="preserve">Documents</w:t>
+      </w:r>
+      <w:r>
+        <w:t xml:space="preserve"> </w:t>
+      </w:r>
+      <w:r>
+        <w:t xml:space="preserve">card appears in both places for every record type that supports files (clients, packing lists, donations, pledges, campaigns, events, deliveries, pickups, inventory items, vendors, and volunteers). On an edit form the card shows once the record has been saved. (Donors are added and edited through a pop-up form, so their Documents card lives on the donor's detail page.)</w:t>
       </w:r>
     </w:p>
     <w:p>
@@ -7077,7 +7122,7 @@
           <w:bCs/>
           <w:b/>
         </w:rPr>
-        <w:t xml:space="preserve">Attachments</w:t>
+        <w:t xml:space="preserve">Documents</w:t>
       </w:r>
       <w:r>
         <w:t xml:space="preserve"> </w:t>

</xml_diff>